<commit_message>
Articulo: enlaces azules, iconos ORCID y CC BY, titulo en azul y datos del autor
- Hipervinculos (estilo Hyperlink) en ORCID, repositorio, referencias y licencia CC
- Icono ORCID iD, insignia CC BY y rotulo "Articulo cientifico" como en la plantilla
- Afiliacion: Departamento de Ciencias Informaticas y Robotica; carrera: Ingenieria en IA
- Palabras clave verificadas en el Tesauro de la UNESCO (inteligencia artificial,
  reconocimiento de formas, carretera); titulo y resumenes las incluyen
</commit_message>
<xml_diff>
--- a/docs/articulo_deteccion_baches.docx
+++ b/docs/articulo_deteccion_baches.docx
@@ -4,6 +4,23 @@
   <w:body>
     <w:p>
       <w:pPr>
+        <w:pStyle w:val="Title"/>
+        <w:keepNext w:val="0"/>
+        <w:spacing w:before="0" w:after="80" w:line="240" w:lineRule="auto"/>
+        <w:jc w:val="center"/>
+      </w:pPr>
+      <w:r>
+        <w:rPr>
+          <w:rFonts w:ascii="Arial" w:hAnsi="Arial" w:cs="Arial" w:eastAsia="Arial"/>
+          <w:b/>
+          <w:color w:val="001F5F"/>
+          <w:sz w:val="32"/>
+        </w:rPr>
+        <w:t>Artículo científico</w:t>
+      </w:r>
+    </w:p>
+    <w:p>
+      <w:pPr>
         <w:pStyle w:val="BodyText"/>
         <w:keepNext w:val="0"/>
         <w:spacing w:before="160" w:after="120" w:line="276" w:lineRule="auto"/>
@@ -15,7 +32,7 @@
           <w:b/>
           <w:sz w:val="28"/>
         </w:rPr>
-        <w:t>Verificación reproducible de un detector de baches con inteligencia artificial</w:t>
+        <w:t>Verificación reproducible de un detector de baches de carretera con inteligencia artificial</w:t>
       </w:r>
     </w:p>
     <w:p>
@@ -31,7 +48,7 @@
           <w:i/>
           <w:sz w:val="24"/>
         </w:rPr>
-        <w:t>Reproducible verification of a pothole detector using artificial intelligence</w:t>
+        <w:t>Reproducible verification of a road pothole detector using artificial intelligence</w:t>
       </w:r>
     </w:p>
     <w:p>
@@ -47,7 +64,7 @@
           <w:i/>
           <w:sz w:val="24"/>
         </w:rPr>
-        <w:t>Verificação reprodutível de um detector de buracos com inteligência artificial</w:t>
+        <w:t>Verificação reprodutível de um detector de buracos de rodovia com inteligência artificial</w:t>
       </w:r>
     </w:p>
     <w:p>
@@ -78,15 +95,7 @@
           <w:rFonts w:ascii="Arial" w:hAnsi="Arial" w:cs="Arial" w:eastAsia="Arial"/>
           <w:sz w:val="24"/>
         </w:rPr>
-        <w:t xml:space="preserve">Facultad de </w:t>
-      </w:r>
-      <w:r>
-        <w:rPr>
-          <w:rFonts w:ascii="Arial" w:hAnsi="Arial" w:cs="Arial" w:eastAsia="Arial"/>
-          <w:color w:val="FF0000"/>
-          <w:sz w:val="24"/>
-        </w:rPr>
-        <w:t>por definir</w:t>
+        <w:t>Departamento de Ciencias Informáticas y Robótica</w:t>
       </w:r>
     </w:p>
     <w:p>
@@ -112,12 +121,59 @@
         <w:jc w:val="center"/>
       </w:pPr>
       <w:r>
-        <w:rPr>
-          <w:rFonts w:ascii="Arial" w:hAnsi="Arial" w:cs="Arial" w:eastAsia="Arial"/>
-          <w:sz w:val="24"/>
-        </w:rPr>
-        <w:t>https://orcid.org/0009-0001-1608-5788</w:t>
-      </w:r>
+        <w:drawing>
+          <wp:inline xmlns:a="http://schemas.openxmlformats.org/drawingml/2006/main" xmlns:pic="http://schemas.openxmlformats.org/drawingml/2006/picture">
+            <wp:extent cx="191135" cy="191135"/>
+            <wp:docPr id="1" name="Picture 1"/>
+            <wp:cNvGraphicFramePr>
+              <a:graphicFrameLocks noChangeAspect="1"/>
+            </wp:cNvGraphicFramePr>
+            <a:graphic>
+              <a:graphicData uri="http://schemas.openxmlformats.org/drawingml/2006/picture">
+                <pic:pic>
+                  <pic:nvPicPr>
+                    <pic:cNvPr id="0" name="orcid-id.png"/>
+                    <pic:cNvPicPr/>
+                  </pic:nvPicPr>
+                  <pic:blipFill>
+                    <a:blip r:embed="rId26"/>
+                    <a:stretch>
+                      <a:fillRect/>
+                    </a:stretch>
+                  </pic:blipFill>
+                  <pic:spPr>
+                    <a:xfrm>
+                      <a:off x="0" y="0"/>
+                      <a:ext cx="191135" cy="191135"/>
+                    </a:xfrm>
+                    <a:prstGeom prst="rect"/>
+                  </pic:spPr>
+                </pic:pic>
+              </a:graphicData>
+            </a:graphic>
+          </wp:inline>
+        </w:drawing>
+      </w:r>
+      <w:r>
+        <w:rPr>
+          <w:rFonts w:ascii="Arial" w:hAnsi="Arial" w:cs="Arial" w:eastAsia="Arial"/>
+          <w:sz w:val="24"/>
+        </w:rPr>
+        <w:t xml:space="preserve"> </w:t>
+      </w:r>
+      <w:hyperlink r:id="rId27" w:history="1">
+        <w:r>
+          <w:rPr>
+            <w:rStyle w:val="Hyperlink"/>
+            <w:rFonts w:ascii="Arial" w:hAnsi="Arial" w:cs="Arial" w:eastAsia="Arial"/>
+            <w:color w:val="0000FF"/>
+            <w:sz w:val="24"/>
+            <w:szCs w:val="24"/>
+            <w:u w:val="single"/>
+          </w:rPr>
+          <w:t xml:space="preserve">https://orcid.org/0009-0001-1608-5788</w:t>
+        </w:r>
+      </w:hyperlink>
     </w:p>
     <w:p>
       <w:pPr>
@@ -186,7 +242,7 @@
           <w:rFonts w:ascii="Arial" w:hAnsi="Arial" w:cs="Arial" w:eastAsia="Arial"/>
           <w:sz w:val="24"/>
         </w:rPr>
-        <w:t>El objetivo de la investigación fue verificar, mediante ejecución propia, un detector de baches YOLO11n de una sola clase publicado por un tercero, en relación con la reproducibilidad de sus métricas, la calidad de su conjunto de datos y su uso en un equipo sin GPU. Para ello se desarrolló una investigación con enfoque cuantitativo y diseño de replicación, aplicada a 4.719 imágenes; la recolección de datos se realizó ejecutando el modelo en CPU y registrando sus salidas, y el análisis se llevó a cabo con mAP, precisión, recall, F1 por umbral de confianza y un hash perceptual para medir casi-duplicados. Los resultados evidenciaron que las métricas se reproducen (mAP50 de 0,730 en validación y 0,711 en prueba), que 6,7 % de la prueba tiene un casi-duplicado en entrenamiento sin inflar el mAP, que el mejor F1 (0,654) aparece con un umbral de 0,35 y que el sistema procesa 17,4 cuadros por segundo con una webcam. En conclusión, el reconocimiento de formas del modelo es consistente con lo declarado dentro del dominio de sus datos, pero la procedencia del conjunto de datos y su desempeño con otras cámaras siguen sin verificarse.</w:t>
+        <w:t>El objetivo de la investigación fue verificar, mediante ejecución propia, un detector de baches de carretera basado en inteligencia artificial (YOLO11n, de una sola clase) publicado por un tercero, en relación con la reproducibilidad de sus métricas, la calidad de su conjunto de datos y su uso en un equipo sin GPU. Para ello se desarrolló una investigación con enfoque cuantitativo y diseño de replicación, aplicada a 4.719 imágenes; la recolección de datos se realizó ejecutando el modelo en CPU y registrando sus salidas, y el análisis se llevó a cabo con mAP, precisión, recall, F1 por umbral de confianza y un hash perceptual para medir casi-duplicados. Los resultados evidenciaron que las métricas se reproducen (mAP50 de 0,730 en validación y 0,711 en prueba), que 6,7 % de la prueba tiene un casi-duplicado en entrenamiento sin inflar el mAP, que el mejor F1 (0,654) aparece con un umbral de 0,35 y que el sistema procesa 17,4 cuadros por segundo con una webcam. En conclusión, el reconocimiento de formas del modelo es consistente con lo declarado dentro del dominio de sus datos, pero la procedencia del conjunto de datos y su desempeño con otras cámaras siguen sin verificarse.</w:t>
       </w:r>
     </w:p>
     <w:p>
@@ -210,15 +266,7 @@
           <w:rFonts w:ascii="Arial" w:hAnsi="Arial" w:cs="Arial" w:eastAsia="Arial"/>
           <w:sz w:val="24"/>
         </w:rPr>
-        <w:t xml:space="preserve"> inteligencia artificial, reconocimiento de formas, baches. </w:t>
-      </w:r>
-      <w:r>
-        <w:rPr>
-          <w:rFonts w:ascii="Arial" w:hAnsi="Arial" w:cs="Arial" w:eastAsia="Arial"/>
-          <w:color w:val="FF0000"/>
-          <w:sz w:val="24"/>
-        </w:rPr>
-        <w:t>Pendiente: confirmar los términos en el Tesauro de la UNESCO (en inglés se confirmaron “Artificial intelligence” y “Pattern recognition”) y elegir un tercero.</w:t>
+        <w:t xml:space="preserve"> inteligencia artificial, reconocimiento de formas, carretera</w:t>
       </w:r>
     </w:p>
     <w:p>
@@ -243,7 +291,7 @@
           <w:rFonts w:ascii="Arial" w:hAnsi="Arial" w:cs="Arial" w:eastAsia="Arial"/>
           <w:sz w:val="24"/>
         </w:rPr>
-        <w:t>The objective of the research was to verify, through our own execution, a single-class YOLO11n pothole detector published by a third party, in relation to the reproducibility of its metrics, the quality of its dataset, and its use on a machine without a GPU. To this end, a study with a quantitative approach and a replication design was conducted, applied to 4,719 images; data collection was carried out by running the model on a CPU and recording its outputs, and analysis was performed through mAP, precision, recall, F1 by confidence threshold, and a perceptual hash to measure near-duplicates. The results showed that the metrics are reproduced (mAP50 of 0.730 on validation and 0.711 on test), that 6.7% of the test set has a near-duplicate in the training set without inflating the mAP, that the best F1 (0.654) appears at a threshold of 0.35, and that the system processes 17.4 frames per second with a webcam. In conclusion, the pattern recognition performed by the model is consistent with what is reported within the domain of its data, but the provenance of the dataset and the performance with other cameras remain unverified.</w:t>
+        <w:t>The objective of the research was to verify, through our own execution, a single-class YOLO11n road pothole detector based on artificial intelligence and published by a third party, in relation to the reproducibility of its metrics, the quality of its dataset, and its use on a machine without a GPU. To this end, a study with a quantitative approach and a replication design was conducted, applied to 4,719 images; data collection was carried out by running the model on a CPU and recording its outputs, and analysis was performed through mAP, precision, recall, F1 by confidence threshold, and a perceptual hash to measure near-duplicates. The results showed that the metrics are reproduced (mAP50 of 0.730 on validation and 0.711 on test), that 6.7% of the test set has a near-duplicate in the training set without inflating the mAP, that the best F1 (0.654) appears at a threshold of 0.35, and that the system processes 17.4 frames per second with a webcam. In conclusion, the pattern recognition performed by the model is consistent with what is reported within the domain of its data, but the provenance of the dataset and the performance with other cameras remain unverified.</w:t>
       </w:r>
     </w:p>
     <w:p>
@@ -267,7 +315,7 @@
           <w:rFonts w:ascii="Arial" w:hAnsi="Arial" w:cs="Arial" w:eastAsia="Arial"/>
           <w:sz w:val="24"/>
         </w:rPr>
-        <w:t xml:space="preserve"> artificial intelligence, pattern recognition, potholes</w:t>
+        <w:t xml:space="preserve"> artificial intelligence, pattern recognition, roads</w:t>
       </w:r>
     </w:p>
     <w:p>
@@ -299,7 +347,7 @@
           <w:rFonts w:ascii="Arial" w:hAnsi="Arial" w:cs="Arial" w:eastAsia="Arial"/>
           <w:sz w:val="24"/>
         </w:rPr>
-        <w:t>O objetivo desta pesquisa foi verificar, por meio de execução própria, um detector de buracos YOLO11n de uma única classe publicado por terceiros, em relação à reprodutibilidade de suas métricas, à qualidade de seu conjunto de dados e ao seu uso em um equipamento sem GPU. Para tanto, foi desenvolvida uma pesquisa com abordagem quantitativa e delineamento de replicação, aplicada a 4.719 imagens. A coleta de dados foi realizada executando o modelo em CPU e registrando suas saídas, e a análise foi conduzida por meio de mAP, precisão, recall, F1 por limiar de confiança e um hash perceptual para medir quase duplicatas. Os resultados revelaram que as métricas são reproduzidas (mAP50 de 0,730 na validação e 0,711 no teste), que 6,7 % do teste tem uma quase duplicata no treinamento sem inflar o mAP, que o melhor F1 (0,654) ocorre com um limiar de 0,35 e que o sistema processa 17,4 quadros por segundo com uma webcam. Em conclusão, o reconhecimento de padrões do modelo é consistente com o declarado dentro do domínio de seus dados, mas a procedência do conjunto de dados e o desempenho com outras câmeras continuam sem verificação.</w:t>
+        <w:t>O objetivo desta pesquisa foi verificar, por meio de execução própria, um detector de buracos de rodovia baseado em inteligência artificial (YOLO11n, de uma única classe) publicado por terceiros, em relação à reprodutibilidade de suas métricas, à qualidade de seu conjunto de dados e ao seu uso em um equipamento sem GPU. Para tanto, foi desenvolvida uma pesquisa com abordagem quantitativa e delineamento de replicação, aplicada a 4.719 imagens. A coleta de dados foi realizada executando o modelo em CPU e registrando suas saídas, e a análise foi conduzida por meio de mAP, precisão, recall, F1 por limiar de confiança e um hash perceptual para medir quase duplicatas. Os resultados revelaram que as métricas são reproduzidas (mAP50 de 0,730 na validação e 0,711 no teste), que 6,7 % do teste tem uma quase duplicata no treinamento sem inflar o mAP, que o melhor F1 (0,654) ocorre com um limiar de 0,35 e que o sistema processa 17,4 quadros por segundo com uma webcam. Em conclusão, o reconhecimento de padrões do modelo é consistente com o declarado dentro do domínio de seus dados, mas a procedência do conjunto de dados e o desempenho com outras câmeras continuam sem verificação.</w:t>
       </w:r>
     </w:p>
     <w:p>
@@ -323,7 +371,7 @@
           <w:rFonts w:ascii="Arial" w:hAnsi="Arial" w:cs="Arial" w:eastAsia="Arial"/>
           <w:sz w:val="24"/>
         </w:rPr>
-        <w:t xml:space="preserve"> inteligência artificial, reconhecimento de padrões, buracos</w:t>
+        <w:t xml:space="preserve"> inteligência artificial, reconhecimento de padrões, rodovias</w:t>
       </w:r>
     </w:p>
     <w:p>
@@ -376,22 +424,7 @@
           <w:rFonts w:ascii="Arial" w:hAnsi="Arial" w:cs="Arial" w:eastAsia="Arial"/>
           <w:sz w:val="24"/>
         </w:rPr>
-        <w:t xml:space="preserve">Este manuscrito es resultado de la materia de Inteligencia Artificial (cuarto semestre, primer parcial) de la carrera de </w:t>
-      </w:r>
-      <w:r>
-        <w:rPr>
-          <w:rFonts w:ascii="Arial" w:hAnsi="Arial" w:cs="Arial" w:eastAsia="Arial"/>
-          <w:color w:val="FF0000"/>
-          <w:sz w:val="24"/>
-        </w:rPr>
-        <w:t>carrera por definir</w:t>
-      </w:r>
-      <w:r>
-        <w:rPr>
-          <w:rFonts w:ascii="Arial" w:hAnsi="Arial" w:cs="Arial" w:eastAsia="Arial"/>
-          <w:sz w:val="24"/>
-        </w:rPr>
-        <w:t>, a nivel de licenciatura, en la Universidad Católica Boliviana “San Pablo”. El objetivo fue verificar, con ejecución propia, un detector de baches YOLO11n ya entrenado y publicado por un tercero (Bisman-Singh-Dev, 2026): comprobar la integridad de sus pesos, reproducir sus métricas, medir la fuga de datos entre entrenamiento y prueba, elegir con datos un umbral de confianza y medir su velocidad en un equipo sin GPU. No se entrenó ningún modelo.</w:t>
+        <w:t>Este manuscrito es resultado de la materia de Inteligencia Artificial (cuarto semestre, primer parcial) de la carrera de Ingeniería en Inteligencia Artificial, a nivel de licenciatura, en el Departamento de Ciencias Informáticas y Robótica de la Universidad Católica Boliviana “San Pablo”. El objetivo fue verificar, con ejecución propia, un detector de baches YOLO11n ya entrenado y publicado por un tercero (Bisman-Singh-Dev, 2026): comprobar la integridad de sus pesos, reproducir sus métricas, medir la fuga de datos entre entrenamiento y prueba, elegir con datos un umbral de confianza y medir su velocidad en un equipo sin GPU. No se entrenó ningún modelo.</w:t>
       </w:r>
     </w:p>
     <w:p>
@@ -414,22 +447,27 @@
           <w:rFonts w:ascii="Arial" w:hAnsi="Arial" w:cs="Arial" w:eastAsia="Arial"/>
           <w:sz w:val="24"/>
         </w:rPr>
-        <w:t xml:space="preserve">Se realizó un estudio cuantitativo de replicación: sobre un modelo y un conjunto de datos de un tercero se ejecutaron las evaluaciones que el autor declara y otras adicionales, y se compararon las cifras. El código y las salidas están en el repositorio del proyecto </w:t>
-      </w:r>
-      <w:r>
-        <w:rPr>
-          <w:rFonts w:ascii="Arial" w:hAnsi="Arial" w:cs="Arial" w:eastAsia="Arial"/>
-          <w:color w:val="FF0000"/>
-          <w:sz w:val="24"/>
-        </w:rPr>
-        <w:t>enlace por definir</w:t>
-      </w:r>
-      <w:r>
-        <w:rPr>
-          <w:rFonts w:ascii="Arial" w:hAnsi="Arial" w:cs="Arial" w:eastAsia="Arial"/>
-          <w:sz w:val="24"/>
-        </w:rPr>
-        <w:t>.</w:t>
+        <w:t>Se realizó un estudio cuantitativo de replicación: sobre un modelo y un conjunto de datos de un tercero se ejecutaron las evaluaciones que el autor declara y otras adicionales, y se compararon las cifras. El código y las salidas están en el repositorio del proyecto (</w:t>
+      </w:r>
+      <w:hyperlink r:id="rId28" w:history="1">
+        <w:r>
+          <w:rPr>
+            <w:rStyle w:val="Hyperlink"/>
+            <w:rFonts w:ascii="Arial" w:hAnsi="Arial" w:cs="Arial" w:eastAsia="Arial"/>
+            <w:color w:val="0000FF"/>
+            <w:sz w:val="24"/>
+            <w:szCs w:val="24"/>
+            <w:u w:val="single"/>
+          </w:rPr>
+          <w:t xml:space="preserve">https://github.com/Duranzzz/detector-baches</w:t>
+        </w:r>
+      </w:hyperlink>
+      <w:r>
+        <w:rPr>
+          <w:rFonts w:ascii="Arial" w:hAnsi="Arial" w:cs="Arial" w:eastAsia="Arial"/>
+          <w:sz w:val="24"/>
+        </w:rPr>
+        <w:t>).</w:t>
       </w:r>
     </w:p>
     <w:p>
@@ -2481,7 +2519,7 @@
         <w:drawing>
           <wp:inline xmlns:a="http://schemas.openxmlformats.org/drawingml/2006/main" xmlns:pic="http://schemas.openxmlformats.org/drawingml/2006/picture">
             <wp:extent cx="4846320" cy="2534998"/>
-            <wp:docPr id="1" name="Picture 1"/>
+            <wp:docPr id="2" name="Picture 2"/>
             <wp:cNvGraphicFramePr>
               <a:graphicFrameLocks noChangeAspect="1"/>
             </wp:cNvGraphicFramePr>
@@ -2493,7 +2531,7 @@
                     <pic:cNvPicPr/>
                   </pic:nvPicPr>
                   <pic:blipFill>
-                    <a:blip r:embed="rId26"/>
+                    <a:blip r:embed="rId29"/>
                     <a:stretch>
                       <a:fillRect/>
                     </a:stretch>
@@ -4439,7 +4477,7 @@
         <w:drawing>
           <wp:inline xmlns:a="http://schemas.openxmlformats.org/drawingml/2006/main" xmlns:pic="http://schemas.openxmlformats.org/drawingml/2006/picture">
             <wp:extent cx="4846320" cy="2534998"/>
-            <wp:docPr id="2" name="Picture 2"/>
+            <wp:docPr id="3" name="Picture 3"/>
             <wp:cNvGraphicFramePr>
               <a:graphicFrameLocks noChangeAspect="1"/>
             </wp:cNvGraphicFramePr>
@@ -4451,7 +4489,7 @@
                     <pic:cNvPicPr/>
                   </pic:nvPicPr>
                   <pic:blipFill>
-                    <a:blip r:embed="rId27"/>
+                    <a:blip r:embed="rId30"/>
                     <a:stretch>
                       <a:fillRect/>
                     </a:stretch>
@@ -4682,8 +4720,21 @@
           <w:rFonts w:ascii="Arial" w:hAnsi="Arial" w:cs="Arial" w:eastAsia="Arial"/>
           <w:sz w:val="24"/>
         </w:rPr>
-        <w:t>. https://doi.org/10.48550/arXiv.2209.08538</w:t>
-      </w:r>
+        <w:t xml:space="preserve">. </w:t>
+      </w:r>
+      <w:hyperlink r:id="rId31" w:history="1">
+        <w:r>
+          <w:rPr>
+            <w:rStyle w:val="Hyperlink"/>
+            <w:rFonts w:ascii="Arial" w:hAnsi="Arial" w:cs="Arial" w:eastAsia="Arial"/>
+            <w:color w:val="0000FF"/>
+            <w:sz w:val="24"/>
+            <w:szCs w:val="24"/>
+            <w:u w:val="single"/>
+          </w:rPr>
+          <w:t xml:space="preserve">https://doi.org/10.48550/arXiv.2209.08538</w:t>
+        </w:r>
+      </w:hyperlink>
     </w:p>
     <w:p>
       <w:pPr>
@@ -4713,8 +4764,21 @@
           <w:rFonts w:ascii="Arial" w:hAnsi="Arial" w:cs="Arial" w:eastAsia="Arial"/>
           <w:sz w:val="24"/>
         </w:rPr>
-        <w:t>(6), 41. https://doi.org/10.3390/jimaging6060041</w:t>
-      </w:r>
+        <w:t xml:space="preserve">(6), 41. </w:t>
+      </w:r>
+      <w:hyperlink r:id="rId32" w:history="1">
+        <w:r>
+          <w:rPr>
+            <w:rStyle w:val="Hyperlink"/>
+            <w:rFonts w:ascii="Arial" w:hAnsi="Arial" w:cs="Arial" w:eastAsia="Arial"/>
+            <w:color w:val="0000FF"/>
+            <w:sz w:val="24"/>
+            <w:szCs w:val="24"/>
+            <w:u w:val="single"/>
+          </w:rPr>
+          <w:t xml:space="preserve">https://doi.org/10.3390/jimaging6060041</w:t>
+        </w:r>
+      </w:hyperlink>
     </w:p>
     <w:p>
       <w:pPr>
@@ -4744,8 +4808,21 @@
           <w:rFonts w:ascii="Arial" w:hAnsi="Arial" w:cs="Arial" w:eastAsia="Arial"/>
           <w:sz w:val="24"/>
         </w:rPr>
-        <w:t xml:space="preserve"> [Software, commit bd8238b]. GitHub. https://github.com/Bisman-Singh-Dev/YOLO-Pothole-Detection-Model</w:t>
-      </w:r>
+        <w:t xml:space="preserve"> [Software, commit bd8238b]. GitHub. </w:t>
+      </w:r>
+      <w:hyperlink r:id="rId33" w:history="1">
+        <w:r>
+          <w:rPr>
+            <w:rStyle w:val="Hyperlink"/>
+            <w:rFonts w:ascii="Arial" w:hAnsi="Arial" w:cs="Arial" w:eastAsia="Arial"/>
+            <w:color w:val="0000FF"/>
+            <w:sz w:val="24"/>
+            <w:szCs w:val="24"/>
+            <w:u w:val="single"/>
+          </w:rPr>
+          <w:t xml:space="preserve">https://github.com/Bisman-Singh-Dev/YOLO-Pothole-Detection-Model</w:t>
+        </w:r>
+      </w:hyperlink>
     </w:p>
     <w:p>
       <w:pPr>
@@ -4775,8 +4852,21 @@
           <w:rFonts w:ascii="Arial" w:hAnsi="Arial" w:cs="Arial" w:eastAsia="Arial"/>
           <w:sz w:val="24"/>
         </w:rPr>
-        <w:t>, Artículo 961. https://doi.org/10.1038/s41597-026-07317-w</w:t>
-      </w:r>
+        <w:t xml:space="preserve">, Artículo 961. </w:t>
+      </w:r>
+      <w:hyperlink r:id="rId34" w:history="1">
+        <w:r>
+          <w:rPr>
+            <w:rStyle w:val="Hyperlink"/>
+            <w:rFonts w:ascii="Arial" w:hAnsi="Arial" w:cs="Arial" w:eastAsia="Arial"/>
+            <w:color w:val="0000FF"/>
+            <w:sz w:val="24"/>
+            <w:szCs w:val="24"/>
+            <w:u w:val="single"/>
+          </w:rPr>
+          <w:t xml:space="preserve">https://doi.org/10.1038/s41597-026-07317-w</w:t>
+        </w:r>
+      </w:hyperlink>
     </w:p>
     <w:p>
       <w:pPr>
@@ -4806,8 +4896,21 @@
           <w:rFonts w:ascii="Arial" w:hAnsi="Arial" w:cs="Arial" w:eastAsia="Arial"/>
           <w:sz w:val="24"/>
         </w:rPr>
-        <w:t>(12), 86-92. https://doi.org/10.1145/3458723</w:t>
-      </w:r>
+        <w:t xml:space="preserve">(12), 86-92. </w:t>
+      </w:r>
+      <w:hyperlink r:id="rId35" w:history="1">
+        <w:r>
+          <w:rPr>
+            <w:rStyle w:val="Hyperlink"/>
+            <w:rFonts w:ascii="Arial" w:hAnsi="Arial" w:cs="Arial" w:eastAsia="Arial"/>
+            <w:color w:val="0000FF"/>
+            <w:sz w:val="24"/>
+            <w:szCs w:val="24"/>
+            <w:u w:val="single"/>
+          </w:rPr>
+          <w:t xml:space="preserve">https://doi.org/10.1145/3458723</w:t>
+        </w:r>
+      </w:hyperlink>
     </w:p>
     <w:p>
       <w:pPr>
@@ -4837,8 +4940,21 @@
           <w:rFonts w:ascii="Arial" w:hAnsi="Arial" w:cs="Arial" w:eastAsia="Arial"/>
           <w:sz w:val="24"/>
         </w:rPr>
-        <w:t xml:space="preserve"> (Versión 8.0.0) [Software]. Ultralytics. https://github.com/ultralytics/ultralytics</w:t>
-      </w:r>
+        <w:t xml:space="preserve"> (Versión 8.0.0) [Software]. Ultralytics. </w:t>
+      </w:r>
+      <w:hyperlink r:id="rId36" w:history="1">
+        <w:r>
+          <w:rPr>
+            <w:rStyle w:val="Hyperlink"/>
+            <w:rFonts w:ascii="Arial" w:hAnsi="Arial" w:cs="Arial" w:eastAsia="Arial"/>
+            <w:color w:val="0000FF"/>
+            <w:sz w:val="24"/>
+            <w:szCs w:val="24"/>
+            <w:u w:val="single"/>
+          </w:rPr>
+          <w:t xml:space="preserve">https://github.com/ultralytics/ultralytics</w:t>
+        </w:r>
+      </w:hyperlink>
     </w:p>
     <w:p>
       <w:pPr>
@@ -4868,8 +4984,21 @@
           <w:rFonts w:ascii="Arial" w:hAnsi="Arial" w:cs="Arial" w:eastAsia="Arial"/>
           <w:sz w:val="24"/>
         </w:rPr>
-        <w:t>. https://doi.org/10.48550/arXiv.2410.17725</w:t>
-      </w:r>
+        <w:t xml:space="preserve">. </w:t>
+      </w:r>
+      <w:hyperlink r:id="rId37" w:history="1">
+        <w:r>
+          <w:rPr>
+            <w:rStyle w:val="Hyperlink"/>
+            <w:rFonts w:ascii="Arial" w:hAnsi="Arial" w:cs="Arial" w:eastAsia="Arial"/>
+            <w:color w:val="0000FF"/>
+            <w:sz w:val="24"/>
+            <w:szCs w:val="24"/>
+            <w:u w:val="single"/>
+          </w:rPr>
+          <w:t xml:space="preserve">https://doi.org/10.48550/arXiv.2410.17725</w:t>
+        </w:r>
+      </w:hyperlink>
     </w:p>
     <w:p>
       <w:pPr>
@@ -4899,8 +5028,21 @@
           <w:rFonts w:ascii="Arial" w:hAnsi="Arial" w:cs="Arial" w:eastAsia="Arial"/>
           <w:sz w:val="24"/>
         </w:rPr>
-        <w:t>. https://www.hackerfactor.com/blog/index.php?/archives/529-Kind-of-Like-That.html</w:t>
-      </w:r>
+        <w:t xml:space="preserve">. </w:t>
+      </w:r>
+      <w:hyperlink r:id="rId38" w:history="1">
+        <w:r>
+          <w:rPr>
+            <w:rStyle w:val="Hyperlink"/>
+            <w:rFonts w:ascii="Arial" w:hAnsi="Arial" w:cs="Arial" w:eastAsia="Arial"/>
+            <w:color w:val="0000FF"/>
+            <w:sz w:val="24"/>
+            <w:szCs w:val="24"/>
+            <w:u w:val="single"/>
+          </w:rPr>
+          <w:t xml:space="preserve">https://www.hackerfactor.com/blog/index.php?/archives/529-Kind-of-Like-That.html</w:t>
+        </w:r>
+      </w:hyperlink>
     </w:p>
     <w:p>
       <w:pPr>
@@ -4930,8 +5072,21 @@
           <w:rFonts w:ascii="Arial" w:hAnsi="Arial" w:cs="Arial" w:eastAsia="Arial"/>
           <w:sz w:val="24"/>
         </w:rPr>
-        <w:t>(4), Artículo tdac026. https://doi.org/10.1093/tse/tdac026</w:t>
-      </w:r>
+        <w:t xml:space="preserve">(4), Artículo tdac026. </w:t>
+      </w:r>
+      <w:hyperlink r:id="rId39" w:history="1">
+        <w:r>
+          <w:rPr>
+            <w:rStyle w:val="Hyperlink"/>
+            <w:rFonts w:ascii="Arial" w:hAnsi="Arial" w:cs="Arial" w:eastAsia="Arial"/>
+            <w:color w:val="0000FF"/>
+            <w:sz w:val="24"/>
+            <w:szCs w:val="24"/>
+            <w:u w:val="single"/>
+          </w:rPr>
+          <w:t xml:space="preserve">https://doi.org/10.1093/tse/tdac026</w:t>
+        </w:r>
+      </w:hyperlink>
     </w:p>
     <w:p>
       <w:pPr>
@@ -4961,8 +5116,21 @@
           <w:rFonts w:ascii="Arial" w:hAnsi="Arial" w:cs="Arial" w:eastAsia="Arial"/>
           <w:sz w:val="24"/>
         </w:rPr>
-        <w:t>(3), 279. https://doi.org/10.3390/electronics10030279</w:t>
-      </w:r>
+        <w:t xml:space="preserve">(3), 279. </w:t>
+      </w:r>
+      <w:hyperlink r:id="rId40" w:history="1">
+        <w:r>
+          <w:rPr>
+            <w:rStyle w:val="Hyperlink"/>
+            <w:rFonts w:ascii="Arial" w:hAnsi="Arial" w:cs="Arial" w:eastAsia="Arial"/>
+            <w:color w:val="0000FF"/>
+            <w:sz w:val="24"/>
+            <w:szCs w:val="24"/>
+            <w:u w:val="single"/>
+          </w:rPr>
+          <w:t xml:space="preserve">https://doi.org/10.3390/electronics10030279</w:t>
+        </w:r>
+      </w:hyperlink>
     </w:p>
     <w:p>
       <w:pPr>
@@ -4992,8 +5160,21 @@
           <w:rFonts w:ascii="Arial" w:hAnsi="Arial" w:cs="Arial" w:eastAsia="Arial"/>
           <w:sz w:val="24"/>
         </w:rPr>
-        <w:t>. https://doi.org/10.48550/arXiv.1912.01703</w:t>
-      </w:r>
+        <w:t xml:space="preserve">. </w:t>
+      </w:r>
+      <w:hyperlink r:id="rId41" w:history="1">
+        <w:r>
+          <w:rPr>
+            <w:rStyle w:val="Hyperlink"/>
+            <w:rFonts w:ascii="Arial" w:hAnsi="Arial" w:cs="Arial" w:eastAsia="Arial"/>
+            <w:color w:val="0000FF"/>
+            <w:sz w:val="24"/>
+            <w:szCs w:val="24"/>
+            <w:u w:val="single"/>
+          </w:rPr>
+          <w:t xml:space="preserve">https://doi.org/10.48550/arXiv.1912.01703</w:t>
+        </w:r>
+      </w:hyperlink>
     </w:p>
     <w:p>
       <w:pPr>
@@ -5023,8 +5204,21 @@
           <w:rFonts w:ascii="Arial" w:hAnsi="Arial" w:cs="Arial" w:eastAsia="Arial"/>
           <w:sz w:val="24"/>
         </w:rPr>
-        <w:t>. https://doi.org/10.48550/arXiv.1506.02640</w:t>
-      </w:r>
+        <w:t xml:space="preserve">. </w:t>
+      </w:r>
+      <w:hyperlink r:id="rId42" w:history="1">
+        <w:r>
+          <w:rPr>
+            <w:rStyle w:val="Hyperlink"/>
+            <w:rFonts w:ascii="Arial" w:hAnsi="Arial" w:cs="Arial" w:eastAsia="Arial"/>
+            <w:color w:val="0000FF"/>
+            <w:sz w:val="24"/>
+            <w:szCs w:val="24"/>
+            <w:u w:val="single"/>
+          </w:rPr>
+          <w:t xml:space="preserve">https://doi.org/10.48550/arXiv.1506.02640</w:t>
+        </w:r>
+      </w:hyperlink>
     </w:p>
     <w:p>
       <w:pPr>
@@ -5054,8 +5248,21 @@
           <w:rFonts w:ascii="Arial" w:hAnsi="Arial" w:cs="Arial" w:eastAsia="Arial"/>
           <w:sz w:val="24"/>
         </w:rPr>
-        <w:t>. https://doi.org/10.48550/arXiv.2508.10945</w:t>
-      </w:r>
+        <w:t xml:space="preserve">. </w:t>
+      </w:r>
+      <w:hyperlink r:id="rId43" w:history="1">
+        <w:r>
+          <w:rPr>
+            <w:rStyle w:val="Hyperlink"/>
+            <w:rFonts w:ascii="Arial" w:hAnsi="Arial" w:cs="Arial" w:eastAsia="Arial"/>
+            <w:color w:val="0000FF"/>
+            <w:sz w:val="24"/>
+            <w:szCs w:val="24"/>
+            <w:u w:val="single"/>
+          </w:rPr>
+          <w:t xml:space="preserve">https://doi.org/10.48550/arXiv.2508.10945</w:t>
+        </w:r>
+      </w:hyperlink>
     </w:p>
     <w:p>
       <w:pPr>
@@ -5085,8 +5292,21 @@
           <w:rFonts w:ascii="Arial" w:hAnsi="Arial" w:cs="Arial" w:eastAsia="Arial"/>
           <w:sz w:val="24"/>
         </w:rPr>
-        <w:t>. https://doi.org/10.48550/arXiv.2409.09368</w:t>
-      </w:r>
+        <w:t xml:space="preserve">. </w:t>
+      </w:r>
+      <w:hyperlink r:id="rId44" w:history="1">
+        <w:r>
+          <w:rPr>
+            <w:rStyle w:val="Hyperlink"/>
+            <w:rFonts w:ascii="Arial" w:hAnsi="Arial" w:cs="Arial" w:eastAsia="Arial"/>
+            <w:color w:val="0000FF"/>
+            <w:sz w:val="24"/>
+            <w:szCs w:val="24"/>
+            <w:u w:val="single"/>
+          </w:rPr>
+          <w:t xml:space="preserve">https://doi.org/10.48550/arXiv.2409.09368</w:t>
+        </w:r>
+      </w:hyperlink>
     </w:p>
     <w:p>
       <w:pPr>
@@ -5108,7 +5328,7 @@
           <w:rFonts w:ascii="Arial" w:hAnsi="Arial" w:cs="Arial" w:eastAsia="Arial"/>
           <w:sz w:val="24"/>
         </w:rPr>
-        <w:t xml:space="preserve">Leonardo Duran Cuenca es estudiante de </w:t>
+        <w:t xml:space="preserve">Leonardo Duran Cuenca es estudiante de Ingeniería en Inteligencia Artificial en el Departamento de Ciencias Informáticas y Robótica de la Universidad Católica Boliviana “San Pablo” y cursa el cuarto semestre. Este manuscrito es su trabajo del primer parcial de la materia de Inteligencia Artificial. </w:t>
       </w:r>
       <w:r>
         <w:rPr>
@@ -5116,22 +5336,7 @@
           <w:color w:val="FF0000"/>
           <w:sz w:val="24"/>
         </w:rPr>
-        <w:t>carrera por definir</w:t>
-      </w:r>
-      <w:r>
-        <w:rPr>
-          <w:rFonts w:ascii="Arial" w:hAnsi="Arial" w:cs="Arial" w:eastAsia="Arial"/>
-          <w:sz w:val="24"/>
-        </w:rPr>
-        <w:t xml:space="preserve"> en la Universidad Católica Boliviana “San Pablo” y cursa el cuarto semestre. Este manuscrito es su trabajo del primer parcial de la materia de Inteligencia Artificial. </w:t>
-      </w:r>
-      <w:r>
-        <w:rPr>
-          <w:rFonts w:ascii="Arial" w:hAnsi="Arial" w:cs="Arial" w:eastAsia="Arial"/>
-          <w:color w:val="FF0000"/>
-          <w:sz w:val="24"/>
-        </w:rPr>
-        <w:t>Completar con formación y experiencia en investigación, si corresponde.</w:t>
+        <w:t>Completar con su experiencia en investigaciones.</w:t>
       </w:r>
     </w:p>
     <w:p>
@@ -5219,11 +5424,65 @@
         <w:jc w:val="both"/>
       </w:pPr>
       <w:r>
-        <w:rPr>
-          <w:rFonts w:ascii="Arial" w:hAnsi="Arial" w:cs="Arial" w:eastAsia="Arial"/>
-          <w:sz w:val="24"/>
-        </w:rPr>
-        <w:t>Copyright© 2026 por Leonardo Duran Cuenca. Este texto está protegido por la Licencia Creative Commons Atribución 4.0 Internacional.</w:t>
+        <w:drawing>
+          <wp:inline xmlns:a="http://schemas.openxmlformats.org/drawingml/2006/main" xmlns:pic="http://schemas.openxmlformats.org/drawingml/2006/picture">
+            <wp:extent cx="1227455" cy="427472"/>
+            <wp:docPr id="4" name="Picture 4"/>
+            <wp:cNvGraphicFramePr>
+              <a:graphicFrameLocks noChangeAspect="1"/>
+            </wp:cNvGraphicFramePr>
+            <a:graphic>
+              <a:graphicData uri="http://schemas.openxmlformats.org/drawingml/2006/picture">
+                <pic:pic>
+                  <pic:nvPicPr>
+                    <pic:cNvPr id="0" name="cc-by.png"/>
+                    <pic:cNvPicPr/>
+                  </pic:nvPicPr>
+                  <pic:blipFill>
+                    <a:blip r:embed="rId45"/>
+                    <a:stretch>
+                      <a:fillRect/>
+                    </a:stretch>
+                  </pic:blipFill>
+                  <pic:spPr>
+                    <a:xfrm>
+                      <a:off x="0" y="0"/>
+                      <a:ext cx="1227455" cy="427472"/>
+                    </a:xfrm>
+                    <a:prstGeom prst="rect"/>
+                  </pic:spPr>
+                </pic:pic>
+              </a:graphicData>
+            </a:graphic>
+          </wp:inline>
+        </w:drawing>
+      </w:r>
+      <w:r>
+        <w:rPr>
+          <w:rFonts w:ascii="Arial" w:hAnsi="Arial" w:cs="Arial" w:eastAsia="Arial"/>
+          <w:sz w:val="24"/>
+        </w:rPr>
+        <w:t xml:space="preserve"> Copyright© 2026 por Leonardo Duran Cuenca. Este texto está protegido por la </w:t>
+      </w:r>
+      <w:hyperlink r:id="rId46" w:history="1">
+        <w:r>
+          <w:rPr>
+            <w:rStyle w:val="Hyperlink"/>
+            <w:rFonts w:ascii="Arial" w:hAnsi="Arial" w:cs="Arial" w:eastAsia="Arial"/>
+            <w:color w:val="0000FF"/>
+            <w:sz w:val="24"/>
+            <w:szCs w:val="24"/>
+            <w:u w:val="single"/>
+          </w:rPr>
+          <w:t xml:space="preserve">Licencia Creative Commons Atribución 4.0 Internacional</w:t>
+        </w:r>
+      </w:hyperlink>
+      <w:r>
+        <w:rPr>
+          <w:rFonts w:ascii="Arial" w:hAnsi="Arial" w:cs="Arial" w:eastAsia="Arial"/>
+          <w:sz w:val="24"/>
+        </w:rPr>
+        <w:t>.</w:t>
       </w:r>
     </w:p>
     <w:p>

</xml_diff>

<commit_message>
Filtro de cajas duplicadas al 50 %, grabacion de video y presentacion HTML
- webcam.py: NMS IoU 0.5 (antes 0.7 por defecto); --guardar graba lo que se ve en .mp4
  y --no-show con un video lo procesa entero y guarda video_anotado.mp4
- nms.py: compara NMS 0.7 vs 0.5 en val y test (val mAP50 0.730 -> 0.751,
  test 0.711 -> 0.739; falsas alarmas a conf 0.35: 207 -> 145)
- umbrales.py: opcion --nms; resultados/umbrales_nms050.json
- Articulo: seccion del ajuste del filtro y frase en conclusiones (sigue en 12 paginas)
- docs/presentacion.html: presentacion de 15 diapositivas que funciona sola en el navegador
</commit_message>
<xml_diff>
--- a/docs/articulo_deteccion_baches.docx
+++ b/docs/articulo_deteccion_baches.docx
@@ -3572,7 +3572,7 @@
           <w:rFonts w:ascii="Arial" w:eastAsia="Arial" w:hAnsi="Arial" w:cs="Arial"/>
           <w:b/>
         </w:rPr>
-        <w:t>Velocidad y demostración con cámara</w:t>
+        <w:t>Ajuste del filtro de cajas duplicadas</w:t>
       </w:r>
     </w:p>
     <w:p>
@@ -3585,7 +3585,7 @@
         <w:rPr>
           <w:rFonts w:ascii="Arial" w:eastAsia="Arial" w:hAnsi="Arial" w:cs="Arial"/>
         </w:rPr>
-        <w:t>En CPU, el tiempo de inferencia por imagen es de 62,1 ms en validación y 62,3 ms en prueba con ultralytics (Jocher et al., 2023) sobre PyTorch (Paszke et al., 2019). Con la webcam, la captura más la inferencia, sin ventana, da 17,8 cuadros por segundo (53,6 ms de inferencia por cuadro), y con la ventana de demostración abierta el promedio es de 17,4 cuadros por segundo en 922 cuadros. El README del repositorio de origen declara 5,21 ms por imagen en una GPU NVIDIA RTX 4050; es otro hardware y no se compara con las cifras de CPU. En las pruebas cualitativas, una escena de escritorio sin baches no produce ninguna detección en 60 cuadros con los umbrales de 0,25, 0,35 y 0,50, mientras que con la webcam apuntando al rostro de quien firma este trabajo, en una posición muy concreta, el modelo marca el rostro como un bache (no se registró el umbral ni la frecuencia). Con dos imágenes de prueba, una se detecta con confianza 0,75 en los tres umbrales y otra con confianza 0,32 solo en el umbral de 0,25.</w:t>
+        <w:t>La supresión de no máximos borra una caja que se solapa con otra más confiable por encima de cierto IoU (0,7 por defecto en ultralytics). Bajarlo a 0,5, valor elegido en validación y confirmado en prueba, mejora el detector sin reentrenarlo: el mAP50 pasa de 0,730 a 0,751 en validación y de 0,711 a 0,739 en prueba, y con el umbral de 0,35 las falsas alarmas bajan de 207 a 145 (precisión de 0,738 a 0,800) con el recall casi igual (0,587 frente a 0,585). En la foto de Montreal queda una sola caja. Este valor ya se usa en la demostración.</w:t>
       </w:r>
     </w:p>
     <w:p>
@@ -3599,7 +3599,7 @@
           <w:rFonts w:ascii="Arial" w:eastAsia="Arial" w:hAnsi="Arial" w:cs="Arial"/>
           <w:b/>
         </w:rPr>
-        <w:t>Comparación con estudios similares y limitaciones</w:t>
+        <w:t>Velocidad y demostración con cámara</w:t>
       </w:r>
     </w:p>
     <w:p>
@@ -3612,14 +3612,21 @@
         <w:rPr>
           <w:rFonts w:ascii="Arial" w:eastAsia="Arial" w:hAnsi="Arial" w:cs="Arial"/>
         </w:rPr>
-        <w:t xml:space="preserve">Las cifras declaradas en el repositorio de origen se reproducen con una diferencia de milésimas, en un equipo y con versiones distintas de las usadas originalmente. Esa reproducibilidad no equivale a validez externa: validación y prueba salen del mismo conjunto de datos que entrenamiento, y este contiene repeticiones, por lo que las métricas describen qué tan bien se comporta el modelo en imágenes parecidas a las que vio, no en cualquier calle. Chen et al. (2026) evalúan seis detectores, entre ellos YOLO11 en su variante mediana, sobre HRP4K: YOLO11 alcanza una precisión de 0,742 y un mAP50-95 de 0,407, y el mejor mAP50 de la comparación es de 0,611. El YOLO11n </w:t>
-      </w:r>
-      <w:r>
-        <w:rPr>
-          <w:rFonts w:ascii="Arial" w:eastAsia="Arial" w:hAnsi="Arial" w:cs="Arial"/>
-        </w:rPr>
-        <w:lastRenderedPageBreak/>
-        <w:t>verificado aquí obtiene en prueba una precisión de 0,796, un mAP50 de 0,711 y un mAP50-95 de 0,394, del mismo orden en mAP50-95 con un modelo mucho más pequeño. No son cifras comparables de forma directa: HRP4K reúne imágenes de 3840 × 2160 píxeles con baches muy pequeños (la mediana de la caja es de 100 × 35 píxeles), mientras que 85,9 % de las imágenes del conjunto verificado son de 640 × 640 píxeles.</w:t>
+        <w:t>En CPU, el tiempo de inferencia por imagen es de 62,1 ms en validación y 62,3 ms en prueba con ultralytics (Jocher et al., 2023) sobre PyTorch (Paszke et al., 2019). Con la webcam, la captura más la inferencia, sin ventana, da 17,8 cuadros por segundo (53,6 ms de inferencia por cuadro), y con la ventana de demostración abierta el promedio es de 17,4 cuadros por segundo en 922 cuadros. El README del repositorio de origen declara 5,21 ms por imagen en una GPU NVIDIA RTX 4050; es otro hardware y no se compara con las cifras de CPU. En las pruebas cualitativas, una escena de escritorio sin baches no produce ninguna detección en 60 cuadros con los umbrales de 0,25, 0,35 y 0,50, mientras que con la webcam apuntando al rostro de quien firma este trabajo, en una posición muy concreta, el modelo marca el rostro como un bache (no se registró el umbral ni la frecuencia). Con dos imágenes de prueba, una se detecta con confianza 0,75 en los tres umbrales y otra con confianza 0,32 solo en el umbral de 0,25.</w:t>
+      </w:r>
+    </w:p>
+    <w:p>
+      <w:pPr>
+        <w:pStyle w:val="BodyText"/>
+        <w:keepNext/>
+        <w:spacing w:before="200" w:after="40" w:line="360" w:lineRule="auto"/>
+      </w:pPr>
+      <w:r>
+        <w:rPr>
+          <w:rFonts w:ascii="Arial" w:eastAsia="Arial" w:hAnsi="Arial" w:cs="Arial"/>
+          <w:b/>
+        </w:rPr>
+        <w:t>Comparación con estudios similares y limitaciones</w:t>
       </w:r>
     </w:p>
     <w:p>
@@ -3632,7 +3639,13 @@
         <w:rPr>
           <w:rFonts w:ascii="Arial" w:eastAsia="Arial" w:hAnsi="Arial" w:cs="Arial"/>
         </w:rPr>
-        <w:t>La fuga medida es mayor que la que Barz y Denzler (2020) hallaron en CIFAR-10 (6,7 % frente a 3,3 %), pero no inflaría el mAP: la prueba limpia rinde igual o ligeramente mejor. Pudo deberse a que la muestra contaminada es pequeña y ruidosa o a que el modelo no memoriza las repeticiones lo bastante como para mejorar en ellas; con estos datos no puede distinguirse. Además, el hash perceptual solo detecta copias casi idénticas y no el parecido entre escenas de una misma fuente, así que la medida es un piso de la contaminación y no un techo. Chen et al. (2026) dividen HRP4K por video, de modo que todos los cuadros de un mismo video quedan en una sola partición, y el conjunto verificado no documenta ningún agrupamiento de ese tipo. El rostro marcado como bache es un contraejemplo anecdótico, coherente con un conjunto de una sola clase y casi sin ejemplos negativos: sin ejemplos de lo que no es un bache, el modelo pudo no aprender a rechazar objetos fuera de su dominio. Esto es una hipótesis, no una medición; HRP4K incluye 2.000 imágenes sin baches justamente para medir las falsas alarmas.</w:t>
+        <w:t xml:space="preserve">Esa reproducibilidad no equivale a validez externa: validación y prueba salen del mismo conjunto de datos que entrenamiento, y este contiene repeticiones, por lo que las métricas describen qué tan bien se comporta el modelo en imágenes parecidas a las que vio, no en cualquier calle. Chen et al. (2026) evalúan seis detectores, entre ellos YOLO11 en su variante mediana, sobre HRP4K: YOLO11 alcanza una precisión de 0,742 y un mAP50-95 de 0,407, y el mejor mAP50 de la comparación es de 0,611. El YOLO11n </w:t>
+      </w:r>
+      <w:r>
+        <w:rPr>
+          <w:rFonts w:ascii="Arial" w:eastAsia="Arial" w:hAnsi="Arial" w:cs="Arial"/>
+        </w:rPr>
+        <w:t>verificado aquí obtiene en prueba una precisión de 0,796, un mAP50 de 0,711 y un mAP50-95 de 0,394, del mismo orden en mAP50-95 con un modelo mucho más pequeño. No son comparables de forma directa: HRP4K tiene imágenes de 3840 × 2160 píxeles con baches muy pequeños.</w:t>
       </w:r>
     </w:p>
     <w:p>
@@ -3645,21 +3658,7 @@
         <w:rPr>
           <w:rFonts w:ascii="Arial" w:eastAsia="Arial" w:hAnsi="Arial" w:cs="Arial"/>
         </w:rPr>
-        <w:t>La procedencia del conjunto de datos sigue sin documentarse: el repositorio lo describe como una mezcla de datos sintéticos y reales sin indicar fuente ni licencia, justo lo que una hoja de datos (Gebru et al., 2021) debería contener; por eso este trabajo no redistribuye imágenes del conjunto. La revisión con picklescan no halló patrones maliciosos, pero es heurística (Zhao et al., 2024). Las limitaciones son un solo modelo de una sola fuente, un solo equipo sin GPU, el entrenamiento no reproducido, la ausencia de una prueba externa a las fuentes del conjunto y una observación del rostro basada en una sesión corta y sin registro del umbral.</w:t>
-      </w:r>
-    </w:p>
-    <w:p>
-      <w:pPr>
-        <w:pStyle w:val="Heading1"/>
-        <w:rPr>
-          <w:lang w:val="es-AR"/>
-        </w:rPr>
-      </w:pPr>
-      <w:r>
-        <w:rPr>
-          <w:lang w:val="es-AR"/>
-        </w:rPr>
-        <w:t>Conclusiones</w:t>
+        <w:t>La fuga medida es mayor que la que Barz y Denzler (2020) hallaron en CIFAR-10 (6,7 % frente a 3,3 %), pero no inflaría el mAP: la prueba limpia rinde igual o ligeramente mejor. Además, el hash perceptual solo detecta copias casi idénticas y no el parecido entre escenas de una misma fuente, así que la medida es un piso de la contaminación y no un techo. Chen et al. (2026) dividen HRP4K por video, de modo que todos los cuadros de un mismo video quedan en una sola partición, y el conjunto verificado no documenta ningún agrupamiento de ese tipo. El rostro marcado como bache es un contraejemplo anecdótico, coherente con un conjunto de una sola clase y casi sin ejemplos negativos: sin ejemplos de lo que no es un bache, el modelo pudo no aprender a rechazar objetos fuera de su dominio. Esto es una hipótesis, no una medición.</w:t>
       </w:r>
     </w:p>
     <w:p>
@@ -3672,14 +3671,21 @@
         <w:rPr>
           <w:rFonts w:ascii="Arial" w:eastAsia="Arial" w:hAnsi="Arial" w:cs="Arial"/>
         </w:rPr>
-        <w:t xml:space="preserve">El detector YOLO11n verificado cumple lo que declara el repositorio de origen en las métricas: en validación y prueba se obtiene un mAP50 de 0,730 y 0,711, con diferencias de milésimas respecto de las cifras publicadas. La fuga de datos entre entrenamiento y </w:t>
-      </w:r>
-      <w:r>
-        <w:rPr>
-          <w:rFonts w:ascii="Arial" w:eastAsia="Arial" w:hAnsi="Arial" w:cs="Arial"/>
-        </w:rPr>
-        <w:lastRenderedPageBreak/>
-        <w:t>prueba existe (6,7 % de la prueba), pero no infla el mAP de forma apreciable. El mejor compromiso entre precisión y recall en la prueba se logra con un umbral de confianza de 0,35, y el modelo corre a unos 17 cuadros por segundo con una webcam en un equipo sin GPU.</w:t>
+        <w:t>La procedencia del conjunto de datos sigue sin documentarse: el repositorio lo describe como una mezcla de datos sintéticos y reales sin indicar fuente ni licencia, justo lo que una hoja de datos (Gebru et al., 2021) debería contener; por eso este trabajo no redistribuye imágenes del conjunto. La revisión con picklescan no halló patrones maliciosos, pero es heurística (Zhao et al., 2024). Las limitaciones son un solo modelo de una sola fuente, un solo equipo sin GPU, el entrenamiento no reproducido, la ausencia de una prueba externa a las fuentes del conjunto y una observación del rostro basada en una sesión corta y sin registro del umbral.</w:t>
+      </w:r>
+    </w:p>
+    <w:p>
+      <w:pPr>
+        <w:pStyle w:val="Heading1"/>
+        <w:rPr>
+          <w:lang w:val="es-AR"/>
+        </w:rPr>
+      </w:pPr>
+      <w:r>
+        <w:rPr>
+          <w:lang w:val="es-AR"/>
+        </w:rPr>
+        <w:t>Conclusiones</w:t>
       </w:r>
     </w:p>
     <w:p>
@@ -3692,7 +3698,26 @@
         <w:rPr>
           <w:rFonts w:ascii="Arial" w:eastAsia="Arial" w:hAnsi="Arial" w:cs="Arial"/>
         </w:rPr>
-        <w:t>Quedan fuera de lo verificado la procedencia y la licencia de las imágenes, el comportamiento con cámaras y escenas distintas de las del conjunto de datos, la frecuencia de falsos positivos como el del rostro y el entrenamiento del modelo. Un siguiente paso es evaluarlo con un conjunto externo etiquetado de la misma forma.</w:t>
+        <w:t xml:space="preserve">El detector YOLO11n verificado cumple lo que declara el repositorio de origen en las métricas: en validación y prueba se obtiene un mAP50 de 0,730 y 0,711, con diferencias de milésimas respecto de las cifras publicadas. La fuga de datos entre entrenamiento y </w:t>
+      </w:r>
+      <w:r>
+        <w:rPr>
+          <w:rFonts w:ascii="Arial" w:eastAsia="Arial" w:hAnsi="Arial" w:cs="Arial"/>
+        </w:rPr>
+        <w:t>prueba existe (6,7 % de la prueba), pero no infla el mAP de forma apreciable. El mejor compromiso entre precisión y recall en la prueba se logra con un umbral de confianza de 0,35, y el modelo corre a unos 17 cuadros por segundo con una webcam en un equipo sin GPU. Además, bajar a 0,5 el IoU del filtro de cajas duplicadas sube el mAP50 de prueba a 0,739 sin reentrenar el modelo.</w:t>
+      </w:r>
+    </w:p>
+    <w:p>
+      <w:pPr>
+        <w:pStyle w:val="BodyText"/>
+        <w:spacing w:before="60" w:after="120" w:line="360" w:lineRule="auto"/>
+        <w:jc w:val="both"/>
+      </w:pPr>
+      <w:r>
+        <w:rPr>
+          <w:rFonts w:ascii="Arial" w:eastAsia="Arial" w:hAnsi="Arial" w:cs="Arial"/>
+        </w:rPr>
+        <w:t>Quedan fuera de lo verificado la procedencia y la licencia de las imágenes, el comportamiento con cámaras y escenas distintas de las del conjunto de datos, la frecuencia de falsos positivos como el del rostro y el entrenamiento del modelo.</w:t>
       </w:r>
     </w:p>
     <w:p>

</xml_diff>

<commit_message>
docs: enfocar el articulo en el prototipo y su aplicacion en Santa Cruz
</commit_message>
<xml_diff>
--- a/docs/articulo_deteccion_baches.docx
+++ b/docs/articulo_deteccion_baches.docx
@@ -29,7 +29,7 @@
           <w:b/>
           <w:sz w:val="28"/>
         </w:rPr>
-        <w:t>Reconocimiento de formas de baches de carretera: verificación reproducible con inteligencia artificial</w:t>
+        <w:t xml:space="preserve">Detección de baches para el mantenimiento vial en Santa Cruz</w:t>
       </w:r>
     </w:p>
     <w:p>
@@ -47,7 +47,7 @@
           <w:i/>
           <w:lang w:val="en-GB"/>
         </w:rPr>
-        <w:t>Pattern recognition of road potholes: reproducible verification with artificial intelligence</w:t>
+        <w:t xml:space="preserve">Pothole detection to support road maintenance in Santa Cruz</w:t>
       </w:r>
     </w:p>
     <w:p>
@@ -56,37 +56,12 @@
         <w:spacing w:before="120" w:after="200" w:line="360" w:lineRule="auto"/>
         <w:jc w:val="center"/>
       </w:pPr>
-      <w:proofErr w:type="spellStart"/>
       <w:r>
         <w:rPr>
           <w:rFonts w:ascii="Arial" w:eastAsia="Arial" w:hAnsi="Arial" w:cs="Arial"/>
           <w:i/>
         </w:rPr>
-        <w:t>Reconhecimento</w:t>
-      </w:r>
-      <w:proofErr w:type="spellEnd"/>
-      <w:r>
-        <w:rPr>
-          <w:rFonts w:ascii="Arial" w:eastAsia="Arial" w:hAnsi="Arial" w:cs="Arial"/>
-          <w:i/>
-        </w:rPr>
-        <w:t xml:space="preserve"> de </w:t>
-      </w:r>
-      <w:proofErr w:type="spellStart"/>
-      <w:r>
-        <w:rPr>
-          <w:rFonts w:ascii="Arial" w:eastAsia="Arial" w:hAnsi="Arial" w:cs="Arial"/>
-          <w:i/>
-        </w:rPr>
-        <w:t>padrões</w:t>
-      </w:r>
-      <w:proofErr w:type="spellEnd"/>
-      <w:r>
-        <w:rPr>
-          <w:rFonts w:ascii="Arial" w:eastAsia="Arial" w:hAnsi="Arial" w:cs="Arial"/>
-          <w:i/>
-        </w:rPr>
-        <w:t xml:space="preserve"> de buracos em rodovias: verificação reprodutível com inteligência artificial</w:t>
+        <w:t xml:space="preserve">Detecção de buracos para a manutenção viária em Santa Cruz</w:t>
       </w:r>
     </w:p>
     <w:p>
@@ -261,7 +236,7 @@
         <w:rPr>
           <w:rFonts w:ascii="Arial" w:eastAsia="Arial" w:hAnsi="Arial" w:cs="Arial"/>
         </w:rPr>
-        <w:t>El objetivo de la investigación fue verificar, mediante ejecución propia, un detector de baches de carretera basado en inteligencia artificial (YOLO11n, de una sola clase) publicado por un tercero, en relación con la reproducibilidad de sus métricas, la calidad de su conjunto de datos y su uso en un equipo sin GPU. Para ello se desarrolló una investigación con enfoque cuantitativo y diseño de replicación, aplicada a 4.719 imágenes; la recolección de datos se realizó ejecutando el modelo en CPU y registrando sus salidas, y el análisis se llevó a cabo con mAP, precisión, recall, F1 por umbral de confianza y un hash perceptual para medir casi-duplicados. Los resultados evidenciaron que las métricas se reproducen (mAP50 de 0,730 en validación y 0,711 en prueba), que 6,7 % de la prueba (48 imágenes) tiene un casi-duplicado en entrenamiento sin inflar el mAP, que el mejor F1 (0,654) aparece con un umbral de 0,35 y que el sistema procesa 17,4 cuadros por segundo con una webcam. En conclusión, el reconocimiento de formas del modelo es consistente con lo declarado dentro del dominio de sus datos, pero la procedencia del conjunto de datos y su desempeño con otras cámaras siguen sin verificarse.</w:t>
+        <w:t xml:space="preserve">El objetivo del proyecto es implementar y evaluar un prototipo de detección de baches con utilidad potencial para el mantenimiento vial de Santa Cruz de la Sierra. El sistema integra un detector previamente entrenado por terceros y permite analizar imágenes, una cámara y videos grabados con un celular. Se realiza una evaluación cuantitativa con 4.719 imágenes de referencia y pruebas funcionales en una computadora sin tarjeta gráfica dedicada. Las métricas reproducidas alcanzan un mAP50 de 0,730 en validación y 0,711 en prueba. Un ajuste del filtro de cajas repetidas eleva el mAP50 de prueba a 0,739. El prototipo conserva videos anotados y un resumen por archivo. Las dificultades observadas incluyen baches que dejan de mostrarse al aumentar la exigencia de confianza y una falsa detección sobre un rostro. El sistema constituye una base funcional para reunir evidencia visual que podría apoyar la revisión de calles por la Alcaldía cruceña. Su desempeño en recorridos reales de Santa Cruz todavía no se ha medido; tampoco se ha reproducido el entrenamiento original ni implementado la georreferenciación.</w:t>
       </w:r>
     </w:p>
     <w:p>
@@ -309,47 +284,7 @@
           <w:rFonts w:ascii="Arial" w:eastAsia="Arial" w:hAnsi="Arial" w:cs="Arial"/>
           <w:lang w:val="en-GB"/>
         </w:rPr>
-        <w:t xml:space="preserve">The objective of the research was to verify, through our own execution, a single-class YOLO11n road pothole detector based on artificial intelligence and published </w:t>
-      </w:r>
-      <w:r>
-        <w:rPr>
-          <w:rFonts w:ascii="Arial" w:eastAsia="Arial" w:hAnsi="Arial" w:cs="Arial"/>
-          <w:lang w:val="en-GB"/>
-        </w:rPr>
-        <w:lastRenderedPageBreak/>
-        <w:t xml:space="preserve">by a third party, in relation to the reproducibility of its metrics, the quality of its dataset, and its use on a machine without a GPU. To this end, a study with a quantitative approach and a replication design was conducted, applied to 4,719 images; data collection was carried out by running the model on a CPU and recording its outputs, and analysis was performed through </w:t>
-      </w:r>
-      <w:proofErr w:type="spellStart"/>
-      <w:r>
-        <w:rPr>
-          <w:rFonts w:ascii="Arial" w:eastAsia="Arial" w:hAnsi="Arial" w:cs="Arial"/>
-          <w:lang w:val="en-GB"/>
-        </w:rPr>
-        <w:t>mAP</w:t>
-      </w:r>
-      <w:proofErr w:type="spellEnd"/>
-      <w:r>
-        <w:rPr>
-          <w:rFonts w:ascii="Arial" w:eastAsia="Arial" w:hAnsi="Arial" w:cs="Arial"/>
-          <w:lang w:val="en-GB"/>
-        </w:rPr>
-        <w:t xml:space="preserve">, precision, recall, F1 by confidence threshold, and a perceptual hash to measure near-duplicates. The results showed that the metrics are reproduced (mAP50 of 0.730 on validation and 0.711 on test), that 6.7% of the test set (48 images) has a near-duplicate in the training set without inflating the </w:t>
-      </w:r>
-      <w:proofErr w:type="spellStart"/>
-      <w:r>
-        <w:rPr>
-          <w:rFonts w:ascii="Arial" w:eastAsia="Arial" w:hAnsi="Arial" w:cs="Arial"/>
-          <w:lang w:val="en-GB"/>
-        </w:rPr>
-        <w:t>mAP</w:t>
-      </w:r>
-      <w:proofErr w:type="spellEnd"/>
-      <w:r>
-        <w:rPr>
-          <w:rFonts w:ascii="Arial" w:eastAsia="Arial" w:hAnsi="Arial" w:cs="Arial"/>
-          <w:lang w:val="en-GB"/>
-        </w:rPr>
-        <w:t>, that the best F1 (0.654) appears at a threshold of 0.35, and that the system processes 17.4 frames per second with a webcam. In conclusion, the pattern recognition performed by the model is consistent with what is reported within the domain of its data, but the provenance of the dataset and the performance with other cameras remain unverified.</w:t>
+        <w:t xml:space="preserve">The project aims to implement and evaluate a pothole detection prototype with potential use in road maintenance in Santa Cruz de la Sierra. The system integrates a detector previously trained by third parties and processes images, a camera feed, and videos recorded with a mobile phone. A quantitative assessment uses 4,719 reference images and functional tests on a computer without a dedicated graphics card. Reproduced metrics reach an mAP50 of 0.730 on validation and 0.711 on test. Adjusting the duplicate-box filter raises test mAP50 to 0.739. The prototype saves annotated videos and a summary for each file. Observed difficulties include potholes disappearing when the confidence requirement is increased and a false detection on a face. The system provides a functional basis for collecting visual evidence that could support municipal road inspections. Performance on real routes in Santa Cruz has not yet been measured; the original training has not been reproduced, and georeferencing has not been implemented.</w:t>
       </w:r>
     </w:p>
     <w:p>
@@ -403,7 +338,7 @@
         <w:rPr>
           <w:rFonts w:ascii="Arial" w:eastAsia="Arial" w:hAnsi="Arial" w:cs="Arial"/>
         </w:rPr>
-        <w:t>O objetivo desta pesquisa foi verificar, por meio de execução própria, um detector de buracos de rodovia baseado em inteligência artificial (YOLO11n, de uma única classe) publicado por terceiros, em relação à reprodutibilidade de suas métricas, à qualidade de seu conjunto de dados e ao seu uso em um equipamento sem GPU. Para tanto, foi desenvolvida uma pesquisa com abordagem quantitativa e delineamento de replicação, aplicada a 4.719 imagens. A coleta de dados foi realizada executando o modelo em CPU e registrando suas saídas, e a análise foi conduzida por meio de mAP, precisão, recall, F1 por limiar de confiança e um hash perceptual para medir quase duplicatas. Os resultados revelaram que as métricas são reproduzidas (mAP50 de 0,730 na validação e 0,711 no teste), que 6,7 % do teste (48 imagens) tem uma quase duplicata no treinamento sem inflar o mAP, que o melhor F1 (0,654) ocorre com um limiar de 0,35 e que o sistema processa 17,4 quadros por segundo com uma webcam. Em conclusão, o reconhecimento de padrões do modelo é consistente com o declarado dentro do domínio de seus dados, mas a procedência do conjunto de dados e o desempenho com outras câmeras continuam sem verificação.</w:t>
+        <w:t xml:space="preserve">O objetivo do projeto é implementar e avaliar um protótipo de detecção de buracos com utilidade potencial para a manutenção viária de Santa Cruz de la Sierra. O sistema integra um detector previamente treinado por terceiros e permite analisar imagens, uma câmera e vídeos gravados com um celular. A avaliação quantitativa utiliza 4.719 imagens de referência e testes funcionais em um computador sem placa gráfica dedicada. As métricas reproduzidas alcançam mAP50 de 0,730 na validação e 0,711 no teste. Um ajuste do filtro de caixas repetidas eleva o mAP50 de teste para 0,739. O protótipo salva vídeos anotados e um resumo por arquivo. As dificuldades observadas incluem buracos que deixam de aparecer ao aumentar a exigência de confiança e uma falsa detecção sobre um rosto. O sistema oferece uma base funcional para reunir evidências visuais que poderiam apoiar a inspeção municipal de ruas. O desempenho em percursos reais de Santa Cruz ainda não foi medido; o treinamento original não foi reproduzido e a georreferenciação não foi implementada.</w:t>
       </w:r>
     </w:p>
     <w:p>
@@ -451,14 +386,7 @@
         <w:rPr>
           <w:rFonts w:ascii="Arial" w:eastAsia="Arial" w:hAnsi="Arial" w:cs="Arial"/>
         </w:rPr>
-        <w:t xml:space="preserve">Los baches deterioran la seguridad vial y elevan los costos de mantenimiento, y detectarlos de forma automática con visión por computador es una línea de trabajo consolidada (Ma et al., 2022). La familia YOLO, que parte de los detectores de una sola etapa (Redmon et al., 2016), es la base de buena parte de los sistemas de detección en </w:t>
-      </w:r>
-      <w:r>
-        <w:rPr>
-          <w:rFonts w:ascii="Arial" w:eastAsia="Arial" w:hAnsi="Arial" w:cs="Arial"/>
-        </w:rPr>
-        <w:lastRenderedPageBreak/>
-        <w:t>tiempo real; su versión 11 incorpora bloques C3k2 y de atención espacial C2PSA (Khanam &amp; Hussain, 2024). Para esta tarea existen conjuntos de datos públicos como RDD2022, con 47.420 imágenes de seis países y más de 55.000 instancias de daño en cuatro categorías (Arya et al., 2024), y HRP4K, de imágenes de alta resolución en perspectiva (Chen et al., 2026), y sistemas que combinan YOLO con georreferenciación (Sahoo et al., 2025).</w:t>
+        <w:t xml:space="preserve">La detección de baches mediante imágenes constituye una aplicación de la visión por computadora al mantenimiento de carreteras. Las revisiones de este campo describen sistemas que identifican daños visibles en fotografías y videos, con resultados que dependen de las condiciones de captura y de los datos de evaluación (Ma et al., 2022). Su interés práctico consiste en convertir material visual en evidencia que una persona pueda revisar. Para Santa Cruz de la Sierra, este proyecto plantea una herramienta de apoyo a la inspección vial: registrar posibles baches y conservar imágenes de referencia para su posterior verificación.</w:t>
       </w:r>
     </w:p>
     <w:p>
@@ -471,7 +399,7 @@
         <w:rPr>
           <w:rFonts w:ascii="Arial" w:eastAsia="Arial" w:hAnsi="Arial" w:cs="Arial"/>
         </w:rPr>
-        <w:t>Sin embargo, muchos modelos se publican con métricas autodeclaradas que nadie volvió a ejecutar y con conjuntos de datos cuya procedencia y licencia no están documentadas, algo que las prácticas de documentación de datos buscan evitar (Gebru et al., 2021). Además, si hay imágenes casi idénticas entre entrenamiento y prueba, la métrica de prueba se vuelve optimista: en CIFAR, el 3,3 % y el 10 % de las imágenes de prueba de CIFAR-10 y CIFAR-100 tenían duplicados en el conjunto de entrenamiento (Barz &amp; Denzler, 2020). Por último, se han documentado modelos con código malicioso en repositorios públicos (Zhao et al., 2024), lo que obliga a revisar los archivos de pesos antes de cargarlos.</w:t>
+        <w:t xml:space="preserve">Existen conjuntos públicos destinados al estudio de daños viales, como RDD2022, con 47.420 imágenes de seis países (Arya et al., 2024), y colecciones de imágenes de alta resolución para baches (Chen et al., 2026). También hay propuestas que relacionan detecciones con información geográfica (Sahoo et al., 2025). Sin embargo, disponer de un detector publicado no permite asumir que funcionará en cualquier calle. Es necesario comprobar sus resultados, revisar la calidad de los datos y explicar las limitaciones del prototipo. La documentación de procedencia y condiciones de uso es parte de esa evaluación (Gebru et al., 2021).</w:t>
       </w:r>
     </w:p>
     <w:p>
@@ -484,7 +412,7 @@
         <w:rPr>
           <w:rFonts w:ascii="Arial" w:eastAsia="Arial" w:hAnsi="Arial" w:cs="Arial"/>
         </w:rPr>
-        <w:t>Este manuscrito es resultado de la materia de Inteligencia Artificial (cuarto semestre, primer parcial) de la carrera de Ingeniería en Inteligencia Artificial, a nivel de licenciatura, en el Departamento de Ciencias Informáticas y Robótica de la Universidad Católica Boliviana “San Pablo”. El objetivo fue verificar, con ejecución propia, un detector de baches YOLO11n ya entrenado y publicado por un tercero (Bisman-Singh-Dev, 2026): comprobar la integridad de sus pesos, reproducir sus métricas, medir la fuga de datos entre entrenamiento y prueba, elegir con datos un umbral de confianza y medir su velocidad en un equipo sin GPU. No se entrenó ningún modelo.</w:t>
+        <w:t xml:space="preserve">El objetivo de este trabajo es implementar y evaluar un prototipo que analice una cámara, imágenes y videos para señalar posibles baches. El desarrollo se realiza en la materia de Inteligencia Artificial, cuarto semestre de Ingeniería en Inteligencia Artificial, Departamento de Ciencias Informáticas y Robótica de la Universidad Católica Boliviana “San Pablo”. El aporte propio comprende la integración de la interfaz, el procesamiento de videos, la evaluación de resultados y el análisis de dificultades. El detector se obtiene previamente entrenado del repositorio de Bisman-Singh-Dev (2026); no se presenta un entrenamiento realizado en este proyecto. La aplicación a la Alcaldía cruceña se plantea como uso potencial y no como un servicio municipal desplegado.</w:t>
       </w:r>
     </w:p>
     <w:p>
@@ -511,56 +439,17 @@
         <w:rPr>
           <w:rFonts w:ascii="Arial" w:eastAsia="Arial" w:hAnsi="Arial" w:cs="Arial"/>
         </w:rPr>
-        <w:t xml:space="preserve">Se realizó un estudio cuantitativo de replicación: sobre un modelo y un conjunto de datos de un tercero se ejecutaron las evaluaciones declaradas en el repositorio de origen y otras adicionales, y se compararon las cifras obtenidas con las declaradas. El código y las salidas están en </w:t>
-      </w:r>
-      <w:hyperlink r:id="rId10" w:history="1">
+        <w:t xml:space="preserve">Se desarrolla un prototipo de escritorio y se evalúa mediante pruebas cuantitativas y funcionales. El sistema recibe una imagen, una cámara conectada o un video, identifica regiones compatibles con baches y dibuja recuadros con un indicador de confianza. La interfaz permite ajustar qué detecciones se muestran, pausar la vista y guardar capturas. El detector previamente entrenado y el conjunto de datos provienen del repositorio de Bisman-Singh-Dev, en una versión fijada para mantener la misma base de evaluación. El código del proyecto y las salidas de las pruebas se encuentran en el repositorio público de Leonardo Duran Cuenca.</w:t>
+      </w:r>
+      <w:hyperlink r:id="rId10">
         <w:r>
           <w:rPr>
-            <w:rStyle w:val="Hyperlink"/>
-            <w:rFonts w:ascii="Arial" w:eastAsia="Arial" w:hAnsi="Arial" w:cs="Arial"/>
+            <w:color w:val="0563C1"/>
+            <w:u w:val="single"/>
           </w:rPr>
-          <w:t>https://github.com/Duranzzz/detector-baches</w:t>
+          <w:t xml:space="preserve"> Código y resultados.</w:t>
         </w:r>
       </w:hyperlink>
-      <w:r>
-        <w:rPr>
-          <w:rFonts w:ascii="Arial" w:eastAsia="Arial" w:hAnsi="Arial" w:cs="Arial"/>
-        </w:rPr>
-        <w:t>. El modelo es un YOLO11n de una clase (</w:t>
-      </w:r>
-      <w:r>
-        <w:rPr>
-          <w:rFonts w:ascii="Arial" w:eastAsia="Arial" w:hAnsi="Arial" w:cs="Arial"/>
-          <w:i/>
-        </w:rPr>
-        <w:t>pothole</w:t>
-      </w:r>
-      <w:r>
-        <w:rPr>
-          <w:rFonts w:ascii="Arial" w:eastAsia="Arial" w:hAnsi="Arial" w:cs="Arial"/>
-        </w:rPr>
-        <w:t xml:space="preserve">) con 2.582.347 parámetros una vez fusionadas sus capas y 6,4 GFLOPs, guardado en un archivo de 5.467.546 bytes cuyo SHA-256 es </w:t>
-      </w:r>
-      <w:r>
-        <w:rPr>
-          <w:rFonts w:ascii="Arial" w:eastAsia="Arial" w:hAnsi="Arial" w:cs="Arial"/>
-        </w:rPr>
-        <w:lastRenderedPageBreak/>
-        <w:t xml:space="preserve">f3490f95…c7751c. El </w:t>
-      </w:r>
-      <w:r>
-        <w:rPr>
-          <w:rFonts w:ascii="Arial" w:eastAsia="Arial" w:hAnsi="Arial" w:cs="Arial"/>
-          <w:i/>
-        </w:rPr>
-        <w:t>checkpoint</w:t>
-      </w:r>
-      <w:r>
-        <w:rPr>
-          <w:rFonts w:ascii="Arial" w:eastAsia="Arial" w:hAnsi="Arial" w:cs="Arial"/>
-        </w:rPr>
-        <w:t xml:space="preserve"> registra ultralytics 8.4.108 y un entrenamiento de 15 épocas a 640 píxeles que partió de pesos anteriores del mismo repositorio y no de COCO.</w:t>
-      </w:r>
     </w:p>
     <w:p>
       <w:pPr>
@@ -572,20 +461,7 @@
         <w:rPr>
           <w:rFonts w:ascii="Arial" w:eastAsia="Arial" w:hAnsi="Arial" w:cs="Arial"/>
         </w:rPr>
-        <w:t xml:space="preserve">El conjunto de datos, del mismo repositorio (commit bd8238b), tiene 4.719 imágenes y 7.340 cajas de una sola clase: 3.281 imágenes de entrenamiento (5.353 cajas), 720 de validación (993) y 718 de prueba (994). 85,9 % (4.054 imágenes) mide 640 × 640 píxeles y el resto es más pequeño. No hay líneas de etiqueta malformadas, cajas fuera de rango, imágenes sin etiqueta ni etiquetas sin imagen, y solo 22 archivos de etiqueta están vacíos (imágenes sin baches), menos del 1 % de las imágenes. </w:t>
-      </w:r>
-      <w:r>
-        <w:rPr>
-          <w:rFonts w:ascii="Arial" w:eastAsia="Arial" w:hAnsi="Arial" w:cs="Arial"/>
-          <w:b/>
-        </w:rPr>
-        <w:t>Selección de la muestra:</w:t>
-      </w:r>
-      <w:r>
-        <w:rPr>
-          <w:rFonts w:ascii="Arial" w:eastAsia="Arial" w:hAnsi="Arial" w:cs="Arial"/>
-        </w:rPr>
-        <w:t xml:space="preserve"> no se seleccionó una muestra; se usaron completas las particiones de validación (720 imágenes) y prueba (718) definidas en el conjunto de origen y, solo como referencia de repetición interna, una muestra aleatoria de 500 imágenes de entrenamiento (semilla 0).</w:t>
+        <w:t xml:space="preserve">El conjunto de referencia contiene 4.719 imágenes y 7.340 baches anotados: 3.281 imágenes de entrenamiento, 720 de validación y 718 de prueba. Cada anotación indica la posición de un bache en la imagen. Se utilizan completas las particiones disponibles; no se recolectan todavía imágenes de calles cruceñas. Se revisan la correspondencia entre imágenes y etiquetas, el formato de las anotaciones y la cantidad de ejemplos sin baches. La fuente describe una combinación de imágenes reales y sintéticas, pero no documenta completamente su procedencia ni la licencia de cada colección.</w:t>
       </w:r>
     </w:p>
     <w:p>
@@ -598,33 +474,7 @@
         <w:rPr>
           <w:rFonts w:ascii="Arial" w:eastAsia="Arial" w:hAnsi="Arial" w:cs="Arial"/>
         </w:rPr>
-        <w:t xml:space="preserve">Todo se ejecutó en un equipo con procesador Intel Core i7-1355U (10 núcleos), 7,7 GB de RAM, sin GPU NVIDIA, Windows 11, Python 3.14.7, ultralytics 8.4.171, PyTorch 2.14.1 en su versión para CPU, OpenCV 5.0.0 y una webcam de 640 × 480 píxeles. </w:t>
-      </w:r>
-      <w:r>
-        <w:rPr>
-          <w:rFonts w:ascii="Arial" w:eastAsia="Arial" w:hAnsi="Arial" w:cs="Arial"/>
-          <w:b/>
-        </w:rPr>
-        <w:t>Integridad y seguridad.</w:t>
-      </w:r>
-      <w:r>
-        <w:rPr>
-          <w:rFonts w:ascii="Arial" w:eastAsia="Arial" w:hAnsi="Arial" w:cs="Arial"/>
-        </w:rPr>
-        <w:t xml:space="preserve"> Se calculó el SHA-256 de los pesos y se comparó con el del archivo auditado; después se escaneó el pickle con picklescan para listar las funciones y clases que importa. </w:t>
-      </w:r>
-      <w:r>
-        <w:rPr>
-          <w:rFonts w:ascii="Arial" w:eastAsia="Arial" w:hAnsi="Arial" w:cs="Arial"/>
-          <w:b/>
-        </w:rPr>
-        <w:t>Métricas estándar.</w:t>
-      </w:r>
-      <w:r>
-        <w:rPr>
-          <w:rFonts w:ascii="Arial" w:eastAsia="Arial" w:hAnsi="Arial" w:cs="Arial"/>
-        </w:rPr>
-        <w:t xml:space="preserve"> Con la función de validación de ultralytics (tamaño de imagen 640, lote de 16, umbral de confianza 0,001 y el resto de parámetros por defecto) se midieron precisión, recall, mAP50 y mAP50-95 en validación y prueba.</w:t>
+        <w:t xml:space="preserve">Las pruebas se realizan en Windows 11, en una computadora con procesador Intel Core i7-1355U, 7,7 GB de memoria y sin tarjeta gráfica dedicada. Se verifican los archivos del detector antes de utilizarlos y se reproducen las métricas de validación y prueba, con imágenes procesadas a un tamaño de referencia de 640 píxeles, lotes de 16 y confianza mínima de 0,001. Se registran precisión, exhaustividad o recall y precisión media de detección (mAP). La precisión expresa cuántas detecciones son correctas; el recall, cuántos baches anotados se recuperan. La mAP resume el comportamiento al variar la exigencia de confianza y de coincidencia entre recuadros.</w:t>
       </w:r>
     </w:p>
     <w:p>
@@ -636,219 +486,8 @@
       <w:r>
         <w:rPr>
           <w:rFonts w:ascii="Arial" w:eastAsia="Arial" w:hAnsi="Arial" w:cs="Arial"/>
-          <w:b/>
-        </w:rPr>
-        <w:t>Fuga de datos.</w:t>
-      </w:r>
-      <w:r>
-        <w:rPr>
-          <w:rFonts w:ascii="Arial" w:eastAsia="Arial" w:hAnsi="Arial" w:cs="Arial"/>
-        </w:rPr>
-        <w:t xml:space="preserve"> Cada imagen se redujo a 9 × 8 píxeles en escala de grises y se codificó con el hash de diferencias dHash, que genera 64 bits comparando píxeles adyacentes. La distancia entre dos imágenes es la distancia de Hamming entre sus hashes (ecuación 1). Para cada imagen de validación y de prueba se halló la distancia a su vecino más cercano en entrenamiento y se consideró casi-duplicado una distancia menor o igual que 8. También se buscaron duplicados exactos comparando el SHA-256 del contenido de cada archivo. Luego se evaluó por separado el subconjunto de prueba sin casi-duplicados (“limpio”) y el que sí los tiene (“contaminado”).</w:t>
-      </w:r>
-    </w:p>
-    <w:p>
-      <w:pPr>
-        <w:tabs>
-          <w:tab w:val="center" w:pos="4680"/>
-          <w:tab w:val="right" w:pos="9360"/>
-        </w:tabs>
-        <w:spacing w:before="120" w:after="120"/>
-      </w:pPr>
-      <w:r>
-        <w:tab/>
-      </w:r>
-      <m:oMath>
-        <m:r>
-          <w:rPr>
-            <w:rFonts w:ascii="Cambria Math" w:hAnsi="Cambria Math"/>
-          </w:rPr>
-          <m:t>d</m:t>
-        </m:r>
-        <m:d>
-          <m:dPr>
-            <m:ctrlPr>
-              <w:rPr>
-                <w:rFonts w:ascii="Cambria Math" w:hAnsi="Cambria Math"/>
-              </w:rPr>
-            </m:ctrlPr>
-          </m:dPr>
-          <m:e>
-            <m:sSub>
-              <m:sSubPr>
-                <m:ctrlPr>
-                  <w:rPr>
-                    <w:rFonts w:ascii="Cambria Math" w:hAnsi="Cambria Math"/>
-                  </w:rPr>
-                </m:ctrlPr>
-              </m:sSubPr>
-              <m:e>
-                <m:r>
-                  <w:rPr>
-                    <w:rFonts w:ascii="Cambria Math" w:hAnsi="Cambria Math"/>
-                  </w:rPr>
-                  <m:t>h</m:t>
-                </m:r>
-              </m:e>
-              <m:sub>
-                <m:r>
-                  <m:rPr>
-                    <m:sty m:val="p"/>
-                  </m:rPr>
-                  <w:rPr>
-                    <w:rFonts w:ascii="Cambria Math" w:hAnsi="Cambria Math"/>
-                  </w:rPr>
-                  <m:t>1</m:t>
-                </m:r>
-              </m:sub>
-            </m:sSub>
-            <m:r>
-              <w:rPr>
-                <w:rFonts w:ascii="Cambria Math" w:hAnsi="Cambria Math"/>
-              </w:rPr>
-              <m:t>,</m:t>
-            </m:r>
-            <m:sSub>
-              <m:sSubPr>
-                <m:ctrlPr>
-                  <w:rPr>
-                    <w:rFonts w:ascii="Cambria Math" w:hAnsi="Cambria Math"/>
-                  </w:rPr>
-                </m:ctrlPr>
-              </m:sSubPr>
-              <m:e>
-                <m:r>
-                  <w:rPr>
-                    <w:rFonts w:ascii="Cambria Math" w:hAnsi="Cambria Math"/>
-                  </w:rPr>
-                  <m:t>h</m:t>
-                </m:r>
-              </m:e>
-              <m:sub>
-                <m:r>
-                  <m:rPr>
-                    <m:sty m:val="p"/>
-                  </m:rPr>
-                  <w:rPr>
-                    <w:rFonts w:ascii="Cambria Math" w:hAnsi="Cambria Math"/>
-                  </w:rPr>
-                  <m:t>2</m:t>
-                </m:r>
-              </m:sub>
-            </m:sSub>
-          </m:e>
-        </m:d>
-        <m:r>
-          <w:rPr>
-            <w:rFonts w:ascii="Cambria Math" w:hAnsi="Cambria Math"/>
-          </w:rPr>
-          <m:t>=</m:t>
-        </m:r>
-        <m:nary>
-          <m:naryPr>
-            <m:chr m:val="∑"/>
-            <m:limLoc m:val="undOvr"/>
-            <m:ctrlPr>
-              <w:rPr>
-                <w:rFonts w:ascii="Cambria Math" w:hAnsi="Cambria Math"/>
-              </w:rPr>
-            </m:ctrlPr>
-          </m:naryPr>
-          <m:sub>
-            <m:r>
-              <m:rPr>
-                <m:sty m:val="p"/>
-              </m:rPr>
-              <w:rPr>
-                <w:rFonts w:ascii="Cambria Math" w:hAnsi="Cambria Math"/>
-              </w:rPr>
-              <m:t>i=1</m:t>
-            </m:r>
-          </m:sub>
-          <m:sup>
-            <m:r>
-              <m:rPr>
-                <m:sty m:val="p"/>
-              </m:rPr>
-              <w:rPr>
-                <w:rFonts w:ascii="Cambria Math" w:hAnsi="Cambria Math"/>
-              </w:rPr>
-              <m:t>64</m:t>
-            </m:r>
-          </m:sup>
-          <m:e>
-            <m:sSub>
-              <m:sSubPr>
-                <m:ctrlPr>
-                  <w:rPr>
-                    <w:rFonts w:ascii="Cambria Math" w:hAnsi="Cambria Math"/>
-                  </w:rPr>
-                </m:ctrlPr>
-              </m:sSubPr>
-              <m:e>
-                <m:r>
-                  <w:rPr>
-                    <w:rFonts w:ascii="Cambria Math" w:hAnsi="Cambria Math"/>
-                  </w:rPr>
-                  <m:t>h</m:t>
-                </m:r>
-              </m:e>
-              <m:sub>
-                <m:r>
-                  <m:rPr>
-                    <m:sty m:val="p"/>
-                  </m:rPr>
-                  <w:rPr>
-                    <w:rFonts w:ascii="Cambria Math" w:hAnsi="Cambria Math"/>
-                  </w:rPr>
-                  <m:t>1,i</m:t>
-                </m:r>
-              </m:sub>
-            </m:sSub>
-            <m:r>
-              <w:rPr>
-                <w:rFonts w:ascii="Cambria Math" w:hAnsi="Cambria Math"/>
-              </w:rPr>
-              <m:t>⊕</m:t>
-            </m:r>
-            <m:sSub>
-              <m:sSubPr>
-                <m:ctrlPr>
-                  <w:rPr>
-                    <w:rFonts w:ascii="Cambria Math" w:hAnsi="Cambria Math"/>
-                  </w:rPr>
-                </m:ctrlPr>
-              </m:sSubPr>
-              <m:e>
-                <m:r>
-                  <w:rPr>
-                    <w:rFonts w:ascii="Cambria Math" w:hAnsi="Cambria Math"/>
-                  </w:rPr>
-                  <m:t>h</m:t>
-                </m:r>
-              </m:e>
-              <m:sub>
-                <m:r>
-                  <m:rPr>
-                    <m:sty m:val="p"/>
-                  </m:rPr>
-                  <w:rPr>
-                    <w:rFonts w:ascii="Cambria Math" w:hAnsi="Cambria Math"/>
-                  </w:rPr>
-                  <m:t>2,i</m:t>
-                </m:r>
-              </m:sub>
-            </m:sSub>
-          </m:e>
-        </m:nary>
-      </m:oMath>
-      <w:r>
-        <w:rPr>
-          <w:rFonts w:ascii="Arial" w:hAnsi="Arial" w:cs="Arial"/>
-          <w:sz w:val="24"/>
-        </w:rPr>
-        <w:tab/>
-        <w:t>[1]</w:t>
+        </w:rPr>
+        <w:t xml:space="preserve">Para revisar si la evaluación contiene imágenes repetidas o muy similares a las de entrenamiento, se calcula una huella visual de 64 bits para cada imagen. Se cuenta la diferencia entre huellas y se considera casi duplicada una imagen con distancia de hasta 8 respecto de alguna imagen de entrenamiento. Se comparan también los contenidos de los archivos para encontrar copias exactas. Finalmente se evalúan por separado la prueba completa, las imágenes sin casi duplicados y aquellas que sí los tienen. Este procedimiento detecta similitudes visuales próximas, pero no garantiza separar todas las escenas relacionadas.</w:t>
       </w:r>
     </w:p>
     <w:p>
@@ -860,276 +499,8 @@
       <w:r>
         <w:rPr>
           <w:rFonts w:ascii="Arial" w:eastAsia="Arial" w:hAnsi="Arial" w:cs="Arial"/>
-          <w:b/>
-        </w:rPr>
-        <w:t>Umbral de confianza.</w:t>
-      </w:r>
-      <w:r>
-        <w:rPr>
-          <w:rFonts w:ascii="Arial" w:eastAsia="Arial" w:hAnsi="Arial" w:cs="Arial"/>
-        </w:rPr>
-        <w:t xml:space="preserve"> Se predijo sobre la prueba con confianza mínima de 0,10 y se </w:t>
-      </w:r>
-      <w:r>
-        <w:rPr>
-          <w:rFonts w:ascii="Arial" w:eastAsia="Arial" w:hAnsi="Arial" w:cs="Arial"/>
-        </w:rPr>
-        <w:lastRenderedPageBreak/>
-        <w:t>calcularon la precisión, el recall y la F1 en cada umbral entre 0,10 y 0,65. Una caja predicha cuenta como acierto (TP) si su intersección sobre unión (IoU, ecuación 2) con una caja real aún no emparejada es al menos 0,5, con emparejamiento voraz por confianza descendente; si no, es un falso positivo (FP), y una caja real sin emparejar es un falso negativo (FN). Con esos conteos se calcularon las ecuaciones 3 a 5.</w:t>
-      </w:r>
-    </w:p>
-    <w:p>
-      <w:pPr>
-        <w:tabs>
-          <w:tab w:val="center" w:pos="4680"/>
-          <w:tab w:val="right" w:pos="9360"/>
-        </w:tabs>
-        <w:spacing w:before="120" w:after="120"/>
-      </w:pPr>
-      <w:r>
-        <w:tab/>
-      </w:r>
-      <m:oMath>
-        <m:r>
-          <m:rPr>
-            <m:sty m:val="p"/>
-          </m:rPr>
-          <w:rPr>
-            <w:rFonts w:ascii="Cambria Math" w:hAnsi="Cambria Math"/>
-          </w:rPr>
-          <m:t>IoU</m:t>
-        </m:r>
-        <m:r>
-          <w:rPr>
-            <w:rFonts w:ascii="Cambria Math" w:hAnsi="Cambria Math"/>
-          </w:rPr>
-          <m:t>=</m:t>
-        </m:r>
-        <m:f>
-          <m:fPr>
-            <m:ctrlPr>
-              <w:rPr>
-                <w:rFonts w:ascii="Cambria Math" w:hAnsi="Cambria Math"/>
-              </w:rPr>
-            </m:ctrlPr>
-          </m:fPr>
-          <m:num>
-            <m:r>
-              <m:rPr>
-                <m:sty m:val="p"/>
-              </m:rPr>
-              <w:rPr>
-                <w:rFonts w:ascii="Cambria Math" w:hAnsi="Cambria Math"/>
-              </w:rPr>
-              <m:t>|A∩B|</m:t>
-            </m:r>
-          </m:num>
-          <m:den>
-            <m:r>
-              <m:rPr>
-                <m:sty m:val="p"/>
-              </m:rPr>
-              <w:rPr>
-                <w:rFonts w:ascii="Cambria Math" w:hAnsi="Cambria Math"/>
-              </w:rPr>
-              <m:t>|A∪B|</m:t>
-            </m:r>
-          </m:den>
-        </m:f>
-      </m:oMath>
-      <w:r>
-        <w:rPr>
-          <w:rFonts w:ascii="Arial" w:hAnsi="Arial" w:cs="Arial"/>
-          <w:sz w:val="24"/>
-        </w:rPr>
-        <w:tab/>
-        <w:t>[2]</w:t>
-      </w:r>
-    </w:p>
-    <w:p>
-      <w:pPr>
-        <w:tabs>
-          <w:tab w:val="center" w:pos="4680"/>
-          <w:tab w:val="right" w:pos="9360"/>
-        </w:tabs>
-        <w:spacing w:before="120" w:after="120"/>
-      </w:pPr>
-      <w:r>
-        <w:tab/>
-      </w:r>
-      <m:oMath>
-        <m:r>
-          <w:rPr>
-            <w:rFonts w:ascii="Cambria Math" w:hAnsi="Cambria Math"/>
-          </w:rPr>
-          <m:t>P=</m:t>
-        </m:r>
-        <m:f>
-          <m:fPr>
-            <m:ctrlPr>
-              <w:rPr>
-                <w:rFonts w:ascii="Cambria Math" w:hAnsi="Cambria Math"/>
-              </w:rPr>
-            </m:ctrlPr>
-          </m:fPr>
-          <m:num>
-            <m:r>
-              <m:rPr>
-                <m:sty m:val="p"/>
-              </m:rPr>
-              <w:rPr>
-                <w:rFonts w:ascii="Cambria Math" w:hAnsi="Cambria Math"/>
-              </w:rPr>
-              <m:t>TP</m:t>
-            </m:r>
-          </m:num>
-          <m:den>
-            <m:r>
-              <m:rPr>
-                <m:sty m:val="p"/>
-              </m:rPr>
-              <w:rPr>
-                <w:rFonts w:ascii="Cambria Math" w:hAnsi="Cambria Math"/>
-              </w:rPr>
-              <m:t>TP+FP</m:t>
-            </m:r>
-          </m:den>
-        </m:f>
-      </m:oMath>
-      <w:r>
-        <w:rPr>
-          <w:rFonts w:ascii="Arial" w:hAnsi="Arial" w:cs="Arial"/>
-          <w:sz w:val="24"/>
-        </w:rPr>
-        <w:tab/>
-        <w:t>[3]</w:t>
-      </w:r>
-    </w:p>
-    <w:p>
-      <w:pPr>
-        <w:tabs>
-          <w:tab w:val="center" w:pos="4680"/>
-          <w:tab w:val="right" w:pos="9360"/>
-        </w:tabs>
-        <w:spacing w:before="120" w:after="120"/>
-      </w:pPr>
-      <w:r>
-        <w:tab/>
-      </w:r>
-      <m:oMath>
-        <m:r>
-          <w:rPr>
-            <w:rFonts w:ascii="Cambria Math" w:hAnsi="Cambria Math"/>
-          </w:rPr>
-          <m:t>R=</m:t>
-        </m:r>
-        <m:f>
-          <m:fPr>
-            <m:ctrlPr>
-              <w:rPr>
-                <w:rFonts w:ascii="Cambria Math" w:hAnsi="Cambria Math"/>
-              </w:rPr>
-            </m:ctrlPr>
-          </m:fPr>
-          <m:num>
-            <m:r>
-              <m:rPr>
-                <m:sty m:val="p"/>
-              </m:rPr>
-              <w:rPr>
-                <w:rFonts w:ascii="Cambria Math" w:hAnsi="Cambria Math"/>
-              </w:rPr>
-              <m:t>TP</m:t>
-            </m:r>
-          </m:num>
-          <m:den>
-            <m:r>
-              <m:rPr>
-                <m:sty m:val="p"/>
-              </m:rPr>
-              <w:rPr>
-                <w:rFonts w:ascii="Cambria Math" w:hAnsi="Cambria Math"/>
-              </w:rPr>
-              <m:t>TP+FN</m:t>
-            </m:r>
-          </m:den>
-        </m:f>
-      </m:oMath>
-      <w:r>
-        <w:rPr>
-          <w:rFonts w:ascii="Arial" w:hAnsi="Arial" w:cs="Arial"/>
-          <w:sz w:val="24"/>
-        </w:rPr>
-        <w:tab/>
-        <w:t>[4]</w:t>
-      </w:r>
-    </w:p>
-    <w:p>
-      <w:pPr>
-        <w:tabs>
-          <w:tab w:val="center" w:pos="4680"/>
-          <w:tab w:val="right" w:pos="9360"/>
-        </w:tabs>
-        <w:spacing w:before="120" w:after="120"/>
-      </w:pPr>
-      <w:r>
-        <w:tab/>
-      </w:r>
-      <m:oMath>
-        <m:r>
-          <m:rPr>
-            <m:sty m:val="p"/>
-          </m:rPr>
-          <w:rPr>
-            <w:rFonts w:ascii="Cambria Math" w:hAnsi="Cambria Math"/>
-          </w:rPr>
-          <m:t>F1</m:t>
-        </m:r>
-        <m:r>
-          <w:rPr>
-            <w:rFonts w:ascii="Cambria Math" w:hAnsi="Cambria Math"/>
-          </w:rPr>
-          <m:t>=</m:t>
-        </m:r>
-        <m:f>
-          <m:fPr>
-            <m:ctrlPr>
-              <w:rPr>
-                <w:rFonts w:ascii="Cambria Math" w:hAnsi="Cambria Math"/>
-              </w:rPr>
-            </m:ctrlPr>
-          </m:fPr>
-          <m:num>
-            <m:r>
-              <m:rPr>
-                <m:sty m:val="p"/>
-              </m:rPr>
-              <w:rPr>
-                <w:rFonts w:ascii="Cambria Math" w:hAnsi="Cambria Math"/>
-              </w:rPr>
-              <m:t>2PR</m:t>
-            </m:r>
-          </m:num>
-          <m:den>
-            <m:r>
-              <m:rPr>
-                <m:sty m:val="p"/>
-              </m:rPr>
-              <w:rPr>
-                <w:rFonts w:ascii="Cambria Math" w:hAnsi="Cambria Math"/>
-              </w:rPr>
-              <m:t>P+R</m:t>
-            </m:r>
-          </m:den>
-        </m:f>
-      </m:oMath>
-      <w:r>
-        <w:rPr>
-          <w:rFonts w:ascii="Arial" w:hAnsi="Arial" w:cs="Arial"/>
-          <w:sz w:val="24"/>
-        </w:rPr>
-        <w:tab/>
-        <w:t>[5]</w:t>
+        </w:rPr>
+        <w:t xml:space="preserve">Se estudian cinco niveles de confianza, entre 0,10 y 0,65. Una detección se considera correcta cuando coincide al menos en un 50 % con un recuadro real que todavía no ha sido emparejado. Las detecciones restantes cuentan como falsas alarmas y los baches sin detección, como omisiones. Con estos conteos se calcula F1, que combina precisión y recall. Los niveles se exploran sobre la partición de prueba, por lo que el compromiso elegido debe confirmarse en datos independientes. También se evalúa un filtro que elimina recuadros repetidos cuando su solapamiento supera el límite configurado.</w:t>
       </w:r>
     </w:p>
     <w:p>
@@ -1141,15 +512,8 @@
       <w:r>
         <w:rPr>
           <w:rFonts w:ascii="Arial" w:eastAsia="Arial" w:hAnsi="Arial" w:cs="Arial"/>
-          <w:b/>
-        </w:rPr>
-        <w:t>Velocidad y demostración.</w:t>
-      </w:r>
-      <w:r>
-        <w:rPr>
-          <w:rFonts w:ascii="Arial" w:eastAsia="Arial" w:hAnsi="Arial" w:cs="Arial"/>
-        </w:rPr>
-        <w:t xml:space="preserve"> Se registró el tiempo de inferencia por imagen durante la validación y los cuadros por segundo con la webcam: primero sin ventana (60 cuadros, captura más inferencia) y luego con la ventana de demostración abierta (922 cuadros, umbral inicial 0,35). Las pruebas con cámara las hizo quien firma este trabajo, apuntando la webcam a su propio rostro y a una escena de escritorio sin baches, sin conservar imágenes. Además se probó el modo de imagen con dos imágenes de prueba.</w:t>
+        </w:rPr>
+        <w:t xml:space="preserve">La demostración utiliza una webcam de 640 × 480 píxeles y fotografías de referencia. Se mide la velocidad con y sin ventana. Para el uso con celular, el teléfono graba y la computadora procesa el archivo posteriormente: guarda un video con los recuadros, el cuadro con la detección más confiable cuando existe alguna y una tabla de resumen. Esta tabla registra cuadros procesados, cuadros con detecciones, confianza máxima y tiempo. El flujo se comprueba con un video corto de prueba; todavía no se evalúan recorridos reales de Santa Cruz ni se registran coordenadas geográficas.</w:t>
       </w:r>
     </w:p>
     <w:p>
@@ -1177,7 +541,7 @@
           <w:rFonts w:ascii="Arial" w:eastAsia="Arial" w:hAnsi="Arial" w:cs="Arial"/>
           <w:b/>
         </w:rPr>
-        <w:t>Integridad y seguridad de los pesos</w:t>
+        <w:t xml:space="preserve">Funcionamiento e integridad del prototipo</w:t>
       </w:r>
     </w:p>
     <w:p>
@@ -1190,20 +554,7 @@
         <w:rPr>
           <w:rFonts w:ascii="Arial" w:eastAsia="Arial" w:hAnsi="Arial" w:cs="Arial"/>
         </w:rPr>
-        <w:t xml:space="preserve">El SHA-256 del archivo de pesos coincide con el del archivo auditado. El escaneo con picklescan examina un archivo (data.pkl, dentro del contenedor zip del </w:t>
-      </w:r>
-      <w:r>
-        <w:rPr>
-          <w:rFonts w:ascii="Arial" w:eastAsia="Arial" w:hAnsi="Arial" w:cs="Arial"/>
-          <w:i/>
-        </w:rPr>
-        <w:t>checkpoint</w:t>
-      </w:r>
-      <w:r>
-        <w:rPr>
-          <w:rFonts w:ascii="Arial" w:eastAsia="Arial" w:hAnsi="Arial" w:cs="Arial"/>
-        </w:rPr>
-        <w:t>) y no marca archivos infectados ni funciones peligrosas. De las 29 funciones o clases que importa el pickle, marca 24 como sospechosas (clases de torch y de ultralytics, como Conv2d, BatchNorm2d, SiLU, DetectionModel, C3k2, SPPF o C2PSA, y la función set de __builtin__, que no están en su lista blanca) y 5 como inocuas (almacenamientos de tensores, la reconstrucción de tensores y OrderedDict). La etiqueta “sospechosa” no implica peligro: la revisión es heurística, descarta los patrones conocidos de ejecución de código y no demuestra que el archivo sea inocuo.</w:t>
+        <w:t xml:space="preserve">El prototipo admite cámara, imagen y video. La ventana integra controles para ajustar la confianza, pausar, cambiar de cámara y guardar una captura. El procesamiento por lotes permite analizar videos del celular y conservar los resultados para su revisión posterior. La huella del archivo del detector coincide con la revisada en la fuente y el análisis heurístico no encuentra funciones clasificadas como peligrosas. Esta revisión reduce incertidumbre sobre el archivo utilizado, pero no garantiza su inocuidad; la literatura registra riesgos al reutilizar archivos de aprendizaje automático de terceros (Zhao et al., 2024).</w:t>
       </w:r>
     </w:p>
     <w:p>
@@ -1217,7 +568,7 @@
           <w:rFonts w:ascii="Arial" w:eastAsia="Arial" w:hAnsi="Arial" w:cs="Arial"/>
           <w:b/>
         </w:rPr>
-        <w:t>Reproducción de las métricas</w:t>
+        <w:t xml:space="preserve">Resultados de las pruebas de detección</w:t>
       </w:r>
     </w:p>
     <w:p>
@@ -1230,40 +581,7 @@
         <w:rPr>
           <w:rFonts w:ascii="Arial" w:eastAsia="Arial" w:hAnsi="Arial" w:cs="Arial"/>
         </w:rPr>
-        <w:t xml:space="preserve">En validación, las cifras medidas coinciden con las guardadas en el </w:t>
-      </w:r>
-      <w:r>
-        <w:rPr>
-          <w:rFonts w:ascii="Arial" w:eastAsia="Arial" w:hAnsi="Arial" w:cs="Arial"/>
-          <w:i/>
-        </w:rPr>
-        <w:t>checkpoint</w:t>
-      </w:r>
-      <w:r>
-        <w:rPr>
-          <w:rFonts w:ascii="Arial" w:eastAsia="Arial" w:hAnsi="Arial" w:cs="Arial"/>
-        </w:rPr>
-        <w:t xml:space="preserve">, con </w:t>
-      </w:r>
-      <w:r>
-        <w:rPr>
-          <w:rFonts w:ascii="Arial" w:eastAsia="Arial" w:hAnsi="Arial" w:cs="Arial"/>
-        </w:rPr>
-        <w:lastRenderedPageBreak/>
-        <w:t xml:space="preserve">diferencias de 0,002 como máximo (tabla 1). El </w:t>
-      </w:r>
-      <w:r>
-        <w:rPr>
-          <w:rFonts w:ascii="Arial" w:eastAsia="Arial" w:hAnsi="Arial" w:cs="Arial"/>
-          <w:i/>
-        </w:rPr>
-        <w:t>checkpoint</w:t>
-      </w:r>
-      <w:r>
-        <w:rPr>
-          <w:rFonts w:ascii="Arial" w:eastAsia="Arial" w:hAnsi="Arial" w:cs="Arial"/>
-        </w:rPr>
-        <w:t xml:space="preserve"> no trae métricas de prueba, pero el README del repositorio de origen, en el mismo commit, declara para la partición de prueba una precisión de 79,68 %, un recall de 60,00 %, un mAP50 de 71,10 % y un mAP50-95 de 39,37 %, y las cifras medidas aquí coinciden con esas hasta la tercera cifra decimal (diferencia máxima 0,0009). Las métricas siguen las definiciones de Padilla et al. (2021). Estos datos indican que las métricas declaradas se reproducen en un equipo distinto, con otra versión de ultralytics y sin GPU.</w:t>
+        <w:t xml:space="preserve">Con la configuración inicial, el sistema obtiene un mAP50 de 0,730 en validación y de 0,711 en prueba. Las diferencias frente a los valores declarados por la fuente son de milésimas (tabla 1), lo que respalda la reproducción de esa evaluación en el equipo utilizado. En prueba, la precisión es 0,796 y el recall 0,600. Estas métricas describen la partición de referencia y no equivalen a un porcentaje de acierto en calles de Santa Cruz. Se interpretan conforme a las definiciones de evaluación de detección de objetos descritas por Padilla et al. (2021).</w:t>
       </w:r>
     </w:p>
     <w:p>
@@ -2325,18 +1643,10 @@
       <w:r>
         <w:rPr>
           <w:rFonts w:ascii="Arial" w:eastAsia="Arial" w:hAnsi="Arial" w:cs="Arial"/>
-          <w:b/>
           <w:i/>
           <w:sz w:val="20"/>
         </w:rPr>
-        <w:t>Nota.</w:t>
-      </w:r>
-      <w:r>
-        <w:rPr>
-          <w:rFonts w:ascii="Arial" w:eastAsia="Arial" w:hAnsi="Arial" w:cs="Arial"/>
-          <w:sz w:val="20"/>
-        </w:rPr>
-        <w:t xml:space="preserve"> Umbral de confianza 0,001 y tamaño de imagen 640. Las cifras del README se convirtieron de porcentaje a proporción; d es la distancia dHash al conjunto de entrenamiento.</w:t>
+        <w:t xml:space="preserve">Nota. Configuración inicial: confianza mínima 0,001, tamaño de referencia 640 y filtro de recuadros repetidos de 0,7. Los valores declarados provienen de la fuente; d representa la distancia de la huella visual respecto del entrenamiento.</w:t>
       </w:r>
     </w:p>
     <w:p>
@@ -2350,7 +1660,7 @@
           <w:rFonts w:ascii="Arial" w:eastAsia="Arial" w:hAnsi="Arial" w:cs="Arial"/>
           <w:b/>
         </w:rPr>
-        <w:t>Fuga de datos entre entrenamiento y prueba</w:t>
+        <w:t xml:space="preserve">Calidad y repetición de los datos</w:t>
       </w:r>
     </w:p>
     <w:p>
@@ -2363,7 +1673,7 @@
         <w:rPr>
           <w:rFonts w:ascii="Arial" w:eastAsia="Arial" w:hAnsi="Arial" w:cs="Arial"/>
         </w:rPr>
-        <w:t>La distancia dHash (Krawetz, 2013; Farid, 2021) al vecino más cercano de entrenamiento forma dos grupos separados (figura 1): una masa pequeña de imágenes con distancia entre 0 y 8 y el resto concentrado entre 12 y 21, con una mediana de 17. Con el umbral de 8, 5,7 % (41 de 720 imágenes) de la validación y 6,7 % (48 de 718) de la prueba tienen un casi-duplicado en entrenamiento, y 3,3 % (24 imágenes) de la prueba tiene distancia 0, es decir, una imagen visualmente idéntica. Dentro del propio entrenamiento la proporción es mayor: 11,4 % (57 de 500 imágenes de la muestra) con distancia menor o igual que 8. Además hay 13 grupos de archivos con contenido idéntico: 11 copias sobrantes dentro de una misma partición y 2 grupos que cruzan entrenamiento y prueba. Estos datos indican que el conjunto contiene versiones repetidas o derivadas de las mismas fotos.</w:t>
+        <w:t xml:space="preserve">La revisión no encuentra etiquetas malformadas ni imágenes sin su archivo de anotaciones. Sin embargo, solo 22 de las 4.719 imágenes (0,5 %) tienen etiquetas vacías, lo que limita la representación de escenas sin baches. La comparación de huellas visuales identifica casi duplicados en 41 de las 720 imágenes de validación (5,7 %) y en 48 de las 718 de prueba (6,7 %). La figura 1 muestra la distribución de esas diferencias, calculadas mediante el método de Krawetz (2013) y la noción de huella perceptual descrita por Farid (2021). También se encuentran dos grupos de copias exactas que cruzan entrenamiento y prueba.</w:t>
       </w:r>
     </w:p>
     <w:p>
@@ -2429,18 +1739,10 @@
       <w:r>
         <w:rPr>
           <w:rFonts w:ascii="Arial" w:eastAsia="Arial" w:hAnsi="Arial" w:cs="Arial"/>
-          <w:b/>
           <w:i/>
           <w:sz w:val="20"/>
         </w:rPr>
-        <w:t>Nota.</w:t>
-      </w:r>
-      <w:r>
-        <w:rPr>
-          <w:rFonts w:ascii="Arial" w:eastAsia="Arial" w:hAnsi="Arial" w:cs="Arial"/>
-          <w:sz w:val="20"/>
-        </w:rPr>
-        <w:t xml:space="preserve"> Elaboración propia con 720 imágenes de validación y 718 de prueba; cada columna es el número de imágenes con esa distancia dHash y el umbral de casi-duplicado es 8. Datos editables en el gráfico y en datos_graficas.xlsx.</w:t>
+        <w:t xml:space="preserve">Nota. Comparación de 720 imágenes de validación y 718 de prueba con el entrenamiento. Una diferencia de hasta 8 identifica casi duplicados. El gráfico es editable y sus datos se conservan en el archivo complementario.</w:t>
       </w:r>
     </w:p>
     <w:p>
@@ -2453,7 +1755,7 @@
         <w:rPr>
           <w:rFonts w:ascii="Arial" w:eastAsia="Arial" w:hAnsi="Arial" w:cs="Arial"/>
         </w:rPr>
-        <w:t>De las 718 imágenes de prueba, 670 (93,3 %) no tienen casi-duplicado en entrenamiento (prueba limpia) y 48 (6,7 %) sí lo tienen (prueba contaminada). Si la fuga inflara el desempeño, la prueba limpia debería quedar claramente por debajo de la completa; ocurre lo contrario (tabla 1): el mAP50 de la limpia es 0,719 frente a 0,711 de la completa, y el de la contaminada, 0,680, es el más bajo. La contaminada tiene solo 48 imágenes, por lo que su cifra es ruidosa y no debe interpretarse como un efecto real.</w:t>
+        <w:t xml:space="preserve">Al retirar las 48 imágenes de prueba con casi duplicados, quedan 670 imágenes y el mAP50 es 0,719 frente a 0,711 de la prueba completa. No se observa una caída en ese subconjunto; esto no demuestra ausencia de sesgo, porque cambia la composición de las escenas y el método no detecta todas las relaciones entre imágenes. La repetición entre particiones es una limitación que debe controlarse mediante agrupamiento por escena o recorrido (Barz &amp; Denzler, 2020).</w:t>
       </w:r>
     </w:p>
     <w:p>
@@ -2467,7 +1769,7 @@
           <w:rFonts w:ascii="Arial" w:eastAsia="Arial" w:hAnsi="Arial" w:cs="Arial"/>
           <w:b/>
         </w:rPr>
-        <w:t>Umbral de confianza</w:t>
+        <w:t xml:space="preserve">Dificultad para equilibrar detecciones y falsas alarmas</w:t>
       </w:r>
     </w:p>
     <w:p>
@@ -2480,7 +1782,7 @@
         <w:rPr>
           <w:rFonts w:ascii="Arial" w:eastAsia="Arial" w:hAnsi="Arial" w:cs="Arial"/>
         </w:rPr>
-        <w:t>La precisión sube y el recall baja al aumentar el umbral (tabla 2). La F1 es máxima (0,654) con un umbral de 0,35, donde la precisión es 0,738 (583 aciertos en 790 detecciones) y el recall 0,587 (583 de 994 baches). Con 0,50 hay menos falsas alarmas (79 contra 207), pero se pierden más baches reales (508 contra 411). El valor de 0,35 que usa la demostración por defecto coincide con el mejor compromiso medido.</w:t>
+        <w:t xml:space="preserve">Al exigir mayor confianza se reducen las falsas alarmas, pero también se omiten baches reales. En la configuración inicial, un nivel de 0,35 obtiene 583 detecciones correctas, 207 falsas alarmas y 411 omisiones (tabla 2). Una fotografía de referencia produce una detección de confianza 0,32: se muestra con un nivel de 0,25 y desaparece con 0,35. Este ejemplo permite explicar por qué, durante el uso, una imagen puede contener un bache que el sistema no marca. Además, al apuntar la webcam al rostro del autor, una posición concreta genera una falsa detección. No se registra su frecuencia, por lo que se considera una observación cualitativa.</w:t>
       </w:r>
     </w:p>
     <w:p>
@@ -2496,19 +1798,17 @@
           <w:color w:val="000000"/>
           <w:sz w:val="24"/>
         </w:rPr>
-        <w:lastRenderedPageBreak/>
-        <w:t>Tabla 2</w:t>
-      </w:r>
-      <w:r>
-        <w:br/>
+        <w:t xml:space="preserve">Tabla 2</w:t>
       </w:r>
       <w:r>
         <w:rPr>
           <w:rFonts w:ascii="Arial" w:eastAsia="Arial" w:hAnsi="Arial" w:cs="Arial"/>
           <w:color w:val="000000"/>
           <w:sz w:val="24"/>
-        </w:rPr>
-        <w:t>Precisión, recall y F1 por umbral de confianza en la prueba</w:t>
+          <w:i/>
+        </w:rPr>
+        <w:br/>
+        <w:t xml:space="preserve">Detecciones y omisiones según la confianza en la configuración inicial</w:t>
       </w:r>
     </w:p>
     <w:tbl>
@@ -3547,18 +2847,10 @@
       <w:r>
         <w:rPr>
           <w:rFonts w:ascii="Arial" w:eastAsia="Arial" w:hAnsi="Arial" w:cs="Arial"/>
-          <w:b/>
           <w:i/>
           <w:sz w:val="20"/>
         </w:rPr>
-        <w:t>Nota.</w:t>
-      </w:r>
-      <w:r>
-        <w:rPr>
-          <w:rFonts w:ascii="Arial" w:eastAsia="Arial" w:hAnsi="Arial" w:cs="Arial"/>
-          <w:sz w:val="20"/>
-        </w:rPr>
-        <w:t xml:space="preserve"> 718 imágenes y 994 cajas reales; un acierto exige IoU ≥ 0,5.</w:t>
+        <w:t xml:space="preserve">Nota. Configuración inicial con filtro de repetidos de 0,7; 718 imágenes y 994 baches anotados. TP: detecciones correctas; FP: falsas alarmas; FN: baches omitidos. Se exige una coincidencia de al menos el 50 %.</w:t>
       </w:r>
     </w:p>
     <w:p>
@@ -3572,7 +2864,7 @@
           <w:rFonts w:ascii="Arial" w:eastAsia="Arial" w:hAnsi="Arial" w:cs="Arial"/>
           <w:b/>
         </w:rPr>
-        <w:t>Ajuste del filtro de cajas duplicadas</w:t>
+        <w:t xml:space="preserve">Ajuste aplicado al sistema</w:t>
       </w:r>
     </w:p>
     <w:p>
@@ -3585,7 +2877,7 @@
         <w:rPr>
           <w:rFonts w:ascii="Arial" w:eastAsia="Arial" w:hAnsi="Arial" w:cs="Arial"/>
         </w:rPr>
-        <w:t>La supresión de no máximos borra una caja que se solapa con otra más confiable por encima de cierto IoU (0,7 por defecto en ultralytics). Bajarlo a 0,5, valor elegido en validación y confirmado en prueba, mejora el detector sin reentrenarlo: el mAP50 pasa de 0,730 a 0,751 en validación y de 0,711 a 0,739 en prueba, y con el umbral de 0,35 las falsas alarmas bajan de 207 a 145 (precisión de 0,738 a 0,800) con el recall casi igual (0,587 frente a 0,585). En la foto de Montreal queda una sola caja. Este valor ya se usa en la demostración.</w:t>
+        <w:t xml:space="preserve">Reducir de 0,7 a 0,5 el límite de solapamiento del filtro de recuadros repetidos eleva el mAP50 de validación de 0,730 a 0,751 y el de prueba de 0,711 a 0,739. Con confianza 0,35, las falsas alarmas disminuyen de 207 a 145 y las detecciones correctas pasan de 583 a 581. Esta configuración se utiliza actualmente en la demostración. Entre los niveles evaluados con el filtro ajustado, 0,25 obtiene el mayor F1 (0,683), mientras que 0,35 obtiene 0,676 y mayor precisión (0,800 frente a 0,732). La interfaz conserva 0,35 como una opción que reduce falsas alarmas y permite cambiarla durante el uso; no se afirma que sea el mejor nivel para cualquier escena.</w:t>
       </w:r>
     </w:p>
     <w:p>
@@ -3599,7 +2891,7 @@
           <w:rFonts w:ascii="Arial" w:eastAsia="Arial" w:hAnsi="Arial" w:cs="Arial"/>
           <w:b/>
         </w:rPr>
-        <w:t>Velocidad y demostración con cámara</w:t>
+        <w:t xml:space="preserve">Velocidad y procesamiento de videos</w:t>
       </w:r>
     </w:p>
     <w:p>
@@ -3612,7 +2904,7 @@
         <w:rPr>
           <w:rFonts w:ascii="Arial" w:eastAsia="Arial" w:hAnsi="Arial" w:cs="Arial"/>
         </w:rPr>
-        <w:t>En CPU, el tiempo de inferencia por imagen es de 62,1 ms en validación y 62,3 ms en prueba con ultralytics (Jocher et al., 2023) sobre PyTorch (Paszke et al., 2019). Con la webcam, la captura más la inferencia, sin ventana, da 17,8 cuadros por segundo (53,6 ms de inferencia por cuadro), y con la ventana de demostración abierta el promedio es de 17,4 cuadros por segundo en 922 cuadros. El README del repositorio de origen declara 5,21 ms por imagen en una GPU NVIDIA RTX 4050; es otro hardware y no se compara con las cifras de CPU. En las pruebas cualitativas, una escena de escritorio sin baches no produce ninguna detección en 60 cuadros con los umbrales de 0,25, 0,35 y 0,50, mientras que con la webcam apuntando al rostro de quien firma este trabajo, en una posición muy concreta, el modelo marca el rostro como un bache (no se registró el umbral ni la frecuencia). Con dos imágenes de prueba, una se detecta con confianza 0,75 en los tres umbrales y otra con confianza 0,32 solo en el umbral de 0,25.</w:t>
+        <w:t xml:space="preserve">El procesamiento durante la validación requiere aproximadamente 62 milisegundos por imagen. Con la webcam y la interfaz inicial se registra un promedio de 17,4 cuadros por segundo en 922 cuadros; la interfaz posterior con botones se describe en las pruebas de desarrollo en torno a 15–17 cuadros por segundo. El flujo de videos procesa un clip de prueba de 30 cuadros en unos 3 segundos, incluida la carga del detector. Estos valores corresponden a tareas y versiones de interfaz diferentes. El resumen de video cuenta cuadros con detecciones y no baches únicos: un mismo bache puede aparecer en varios cuadros. La velocidad con videos reales de celular en alta resolución sigue pendiente de medición.</w:t>
       </w:r>
     </w:p>
     <w:p>
@@ -3626,7 +2918,7 @@
           <w:rFonts w:ascii="Arial" w:eastAsia="Arial" w:hAnsi="Arial" w:cs="Arial"/>
           <w:b/>
         </w:rPr>
-        <w:t>Comparación con estudios similares y limitaciones</w:t>
+        <w:t xml:space="preserve">Alcance práctico y limitaciones</w:t>
       </w:r>
     </w:p>
     <w:p>
@@ -3639,13 +2931,7 @@
         <w:rPr>
           <w:rFonts w:ascii="Arial" w:eastAsia="Arial" w:hAnsi="Arial" w:cs="Arial"/>
         </w:rPr>
-        <w:t xml:space="preserve">Esa reproducibilidad no equivale a validez externa: validación y prueba salen del mismo conjunto de datos que entrenamiento, y este contiene repeticiones, por lo que las métricas describen qué tan bien se comporta el modelo en imágenes parecidas a las que vio, no en cualquier calle. Chen et al. (2026) evalúan seis detectores, entre ellos YOLO11 en su variante mediana, sobre HRP4K: YOLO11 alcanza una precisión de 0,742 y un mAP50-95 de 0,407, y el mejor mAP50 de la comparación es de 0,611. El YOLO11n </w:t>
-      </w:r>
-      <w:r>
-        <w:rPr>
-          <w:rFonts w:ascii="Arial" w:eastAsia="Arial" w:hAnsi="Arial" w:cs="Arial"/>
-        </w:rPr>
-        <w:t>verificado aquí obtiene en prueba una precisión de 0,796, un mAP50 de 0,711 y un mAP50-95 de 0,394, del mismo orden en mAP50-95 con un modelo mucho más pequeño. No son comparables de forma directa: HRP4K tiene imágenes de 3840 × 2160 píxeles con baches muy pequeños.</w:t>
+        <w:t xml:space="preserve">El resultado disponible es un prototipo local capaz de producir evidencia visual revisable. Podría servir como apoyo a la Alcaldía de Santa Cruz de la Sierra para preparar inspecciones, reunir ejemplos de posibles daños y ordenar material de recorridos. Todavía no se ha probado su uso por personal municipal, ni se ha medido ahorro de tiempo, costo o cobertura. Tampoco existe una estimación automática de profundidad, gravedad o prioridad de reparación. Una detección requiere revisión humana antes de considerarse un daño confirmado.</w:t>
       </w:r>
     </w:p>
     <w:p>
@@ -3658,7 +2944,7 @@
         <w:rPr>
           <w:rFonts w:ascii="Arial" w:eastAsia="Arial" w:hAnsi="Arial" w:cs="Arial"/>
         </w:rPr>
-        <w:t>La fuga medida es mayor que la que Barz y Denzler (2020) hallaron en CIFAR-10 (6,7 % frente a 3,3 %), pero no inflaría el mAP: la prueba limpia rinde igual o ligeramente mejor. Además, el hash perceptual solo detecta copias casi idénticas y no el parecido entre escenas de una misma fuente, así que la medida es un piso de la contaminación y no un techo. Chen et al. (2026) dividen HRP4K por video, de modo que todos los cuadros de un mismo video quedan en una sola partición, y el conjunto verificado no documenta ningún agrupamiento de ese tipo. El rostro marcado como bache es un contraejemplo anecdótico, coherente con un conjunto de una sola clase y casi sin ejemplos negativos: sin ejemplos de lo que no es un bache, el modelo pudo no aprender a rechazar objetos fuera de su dominio. Esto es una hipótesis, no una medición.</w:t>
+        <w:t xml:space="preserve">Las principales limitaciones son la escasez de imágenes sin baches, las repeticiones entre particiones y la falta de evaluación independiente en calles locales. La huella perceptual no permite asegurar la independencia completa de los datos. Las colecciones de otras fuentes, como las descritas por Chen et al. (2026), podrían servir para futuras evaluaciones, con sus condiciones de uso revisadas. La comparación de métricas entre colecciones diferentes no permite atribuir una superioridad directa al prototipo.</w:t>
       </w:r>
     </w:p>
     <w:p>
@@ -3671,7 +2957,7 @@
         <w:rPr>
           <w:rFonts w:ascii="Arial" w:eastAsia="Arial" w:hAnsi="Arial" w:cs="Arial"/>
         </w:rPr>
-        <w:t>La procedencia del conjunto de datos sigue sin documentarse: el repositorio lo describe como una mezcla de datos sintéticos y reales sin indicar fuente ni licencia, justo lo que una hoja de datos (Gebru et al., 2021) debería contener; por eso este trabajo no redistribuye imágenes del conjunto. La revisión con picklescan no halló patrones maliciosos, pero es heurística (Zhao et al., 2024). Las limitaciones son un solo modelo de una sola fuente, un solo equipo sin GPU, el entrenamiento no reproducido, la ausencia de una prueba externa a las fuentes del conjunto y una observación del rostro basada en una sesión corta y sin registro del umbral.</w:t>
+        <w:t xml:space="preserve">No se reproduce el entrenamiento original y no se dispone de una trazabilidad completa de su proceso y sus datos. Por ello, las pruebas verifican el uso del detector recibido, pero no explican cómo se obtuvo todo su aprendizaje. La documentación de datos debe distinguir la fuente externa, las pruebas propias y las condiciones todavía desconocidas (Gebru et al., 2021). El conjunto actual no se redistribuye como una colección propia; se conserva la referencia de origen y se plantea documentar una colección local antes de publicarla.</w:t>
       </w:r>
     </w:p>
     <w:p>
@@ -3698,13 +2984,7 @@
         <w:rPr>
           <w:rFonts w:ascii="Arial" w:eastAsia="Arial" w:hAnsi="Arial" w:cs="Arial"/>
         </w:rPr>
-        <w:t xml:space="preserve">El detector YOLO11n verificado cumple lo que declara el repositorio de origen en las métricas: en validación y prueba se obtiene un mAP50 de 0,730 y 0,711, con diferencias de milésimas respecto de las cifras publicadas. La fuga de datos entre entrenamiento y </w:t>
-      </w:r>
-      <w:r>
-        <w:rPr>
-          <w:rFonts w:ascii="Arial" w:eastAsia="Arial" w:hAnsi="Arial" w:cs="Arial"/>
-        </w:rPr>
-        <w:t>prueba existe (6,7 % de la prueba), pero no infla el mAP de forma apreciable. El mejor compromiso entre precisión y recall en la prueba se logra con un umbral de confianza de 0,35, y el modelo corre a unos 17 cuadros por segundo con una webcam en un equipo sin GPU. Además, bajar a 0,5 el IoU del filtro de cajas duplicadas sube el mAP50 de prueba a 0,739 sin reentrenar el modelo.</w:t>
+        <w:t xml:space="preserve">El proyecto integra un sistema funcional de detección de baches mediante cámara, imágenes y videos, con controles para revisar las salidas y conservar evidencia. La evaluación reproduce las cifras de la fuente y un ajuste del filtro de recuadros repetidos alcanza un mAP50 de 0,739 en la prueba de referencia. Las omisiones al aumentar la confianza y la falsa detección observada muestran la necesidad de revisar sus resultados. Su utilidad para el mantenimiento vial cruceño es potencial: todavía se requiere evaluar recorridos reales y registrar ejemplos de aciertos y errores.</w:t>
       </w:r>
     </w:p>
     <w:p>
@@ -3717,7 +2997,7 @@
         <w:rPr>
           <w:rFonts w:ascii="Arial" w:eastAsia="Arial" w:hAnsi="Arial" w:cs="Arial"/>
         </w:rPr>
-        <w:t>Quedan fuera de lo verificado la procedencia y la licencia de las imágenes, el comportamiento con cámaras y escenas distintas de las del conjunto de datos, la frecuencia de falsos positivos como el del rostro y el entrenamiento del modelo.</w:t>
+        <w:t xml:space="preserve">La segunda etapa abordará datos locales, un entrenamiento documentado y la vinculación de detecciones con un mapa de Santa Cruz de la Sierra. Para ello será necesario registrar hora y ubicación del celular, relacionarlas con los cuadros y agrupar observaciones repetidas de un mismo posible bache. La georreferenciación y el uso municipal se mantienen como acciones futuras.</w:t>
       </w:r>
     </w:p>
     <w:p>
@@ -3742,6 +3022,7 @@
         <w:rPr>
           <w:lang w:val="en-GB"/>
         </w:rPr>
+        <w:keepLines w:val="1"/>
       </w:pPr>
       <w:r>
         <w:rPr>
@@ -3790,6 +3071,7 @@
         <w:rPr>
           <w:lang w:val="en-GB"/>
         </w:rPr>
+        <w:keepLines w:val="1"/>
       </w:pPr>
       <w:r>
         <w:rPr>
@@ -3832,37 +3114,22 @@
         <w:rPr>
           <w:lang w:val="en-GB"/>
         </w:rPr>
+        <w:keepLines w:val="1"/>
       </w:pPr>
       <w:r>
         <w:rPr>
           <w:rFonts w:ascii="Arial" w:eastAsia="Arial" w:hAnsi="Arial" w:cs="Arial"/>
           <w:lang w:val="en-GB"/>
         </w:rPr>
-        <w:t xml:space="preserve">Bisman-Singh-Dev. (2026). </w:t>
-      </w:r>
-      <w:r>
-        <w:rPr>
-          <w:rFonts w:ascii="Arial" w:eastAsia="Arial" w:hAnsi="Arial" w:cs="Arial"/>
-          <w:i/>
-          <w:lang w:val="en-GB"/>
-        </w:rPr>
-        <w:t>YOLO-Pothole-Detection-Model</w:t>
-      </w:r>
-      <w:r>
-        <w:rPr>
-          <w:rFonts w:ascii="Arial" w:eastAsia="Arial" w:hAnsi="Arial" w:cs="Arial"/>
-          <w:lang w:val="en-GB"/>
-        </w:rPr>
-        <w:t xml:space="preserve"> [Software, commit bd8238b]. GitHub. </w:t>
-      </w:r>
-      <w:hyperlink r:id="rId14" w:history="1">
+        <w:t xml:space="preserve">Bisman-Singh-Dev. (2026). [Código fuente, datos y pesos de un detector de baches; versión bd8238b]. GitHub. </w:t>
+      </w:r>
+      <w:hyperlink r:id="rId32">
         <w:r>
           <w:rPr>
-            <w:rStyle w:val="Hyperlink"/>
-            <w:rFonts w:ascii="Arial" w:eastAsia="Arial" w:hAnsi="Arial" w:cs="Arial"/>
-            <w:lang w:val="en-GB"/>
+            <w:color w:val="0563C1"/>
+            <w:u w:val="single"/>
           </w:rPr>
-          <w:t>https://github.com/Bisman-Singh-Dev/YOLO-Pothole-Detection-Model</w:t>
+          <w:t xml:space="preserve">Repositorio de origen.</w:t>
         </w:r>
       </w:hyperlink>
     </w:p>
@@ -3874,6 +3141,7 @@
         <w:rPr>
           <w:lang w:val="en-GB"/>
         </w:rPr>
+        <w:keepLines w:val="1"/>
       </w:pPr>
       <w:r>
         <w:rPr>
@@ -3932,6 +3200,7 @@
         <w:rPr>
           <w:lang w:val="en-GB"/>
         </w:rPr>
+        <w:keepLines w:val="1"/>
       </w:pPr>
       <w:r>
         <w:rPr>
@@ -3974,6 +3243,7 @@
         <w:rPr>
           <w:lang w:val="en-GB"/>
         </w:rPr>
+        <w:keepLines w:val="1"/>
       </w:pPr>
       <w:r>
         <w:rPr>
@@ -4032,89 +3302,7 @@
         <w:rPr>
           <w:lang w:val="en-GB"/>
         </w:rPr>
-      </w:pPr>
-      <w:r>
-        <w:rPr>
-          <w:rFonts w:ascii="Arial" w:eastAsia="Arial" w:hAnsi="Arial" w:cs="Arial"/>
-        </w:rPr>
-        <w:t xml:space="preserve">Jocher, G., Qiu, J., &amp; Chaurasia, A. (2023). </w:t>
-      </w:r>
-      <w:r>
-        <w:rPr>
-          <w:rFonts w:ascii="Arial" w:eastAsia="Arial" w:hAnsi="Arial" w:cs="Arial"/>
-          <w:i/>
-        </w:rPr>
-        <w:t>Ultralytics YOLO</w:t>
-      </w:r>
-      <w:r>
-        <w:rPr>
-          <w:rFonts w:ascii="Arial" w:eastAsia="Arial" w:hAnsi="Arial" w:cs="Arial"/>
-        </w:rPr>
-        <w:t xml:space="preserve"> (Versión 8.0.0) [Software]. Ultralytics. </w:t>
-      </w:r>
-      <w:hyperlink r:id="rId18" w:history="1">
-        <w:r>
-          <w:rPr>
-            <w:rStyle w:val="Hyperlink"/>
-            <w:rFonts w:ascii="Arial" w:eastAsia="Arial" w:hAnsi="Arial" w:cs="Arial"/>
-            <w:lang w:val="en-GB"/>
-          </w:rPr>
-          <w:t>https://github.com/ultralytics/ultralytics</w:t>
-        </w:r>
-      </w:hyperlink>
-    </w:p>
-    <w:p>
-      <w:pPr>
-        <w:pStyle w:val="BodyText"/>
-        <w:spacing w:after="60" w:line="360" w:lineRule="auto"/>
-        <w:ind w:left="720" w:hanging="720"/>
-        <w:rPr>
-          <w:lang w:val="en-GB"/>
-        </w:rPr>
-      </w:pPr>
-      <w:r>
-        <w:rPr>
-          <w:rFonts w:ascii="Arial" w:eastAsia="Arial" w:hAnsi="Arial" w:cs="Arial"/>
-          <w:lang w:val="en-GB"/>
-        </w:rPr>
-        <w:t xml:space="preserve">Khanam, R., &amp; Hussain, M. (2024). YOLOv11: An overview of the key architectural enhancements. </w:t>
-      </w:r>
-      <w:proofErr w:type="spellStart"/>
-      <w:r>
-        <w:rPr>
-          <w:rFonts w:ascii="Arial" w:eastAsia="Arial" w:hAnsi="Arial" w:cs="Arial"/>
-          <w:i/>
-          <w:lang w:val="en-GB"/>
-        </w:rPr>
-        <w:t>arXiv</w:t>
-      </w:r>
-      <w:proofErr w:type="spellEnd"/>
-      <w:r>
-        <w:rPr>
-          <w:rFonts w:ascii="Arial" w:eastAsia="Arial" w:hAnsi="Arial" w:cs="Arial"/>
-          <w:lang w:val="en-GB"/>
-        </w:rPr>
-        <w:t xml:space="preserve">. </w:t>
-      </w:r>
-      <w:hyperlink r:id="rId19" w:history="1">
-        <w:r>
-          <w:rPr>
-            <w:rStyle w:val="Hyperlink"/>
-            <w:rFonts w:ascii="Arial" w:eastAsia="Arial" w:hAnsi="Arial" w:cs="Arial"/>
-            <w:lang w:val="en-GB"/>
-          </w:rPr>
-          <w:t>https://doi.org/10.48550/arXiv.2410.17725</w:t>
-        </w:r>
-      </w:hyperlink>
-    </w:p>
-    <w:p>
-      <w:pPr>
-        <w:pStyle w:val="BodyText"/>
-        <w:spacing w:after="60" w:line="360" w:lineRule="auto"/>
-        <w:ind w:left="720" w:hanging="720"/>
-        <w:rPr>
-          <w:lang w:val="en-GB"/>
-        </w:rPr>
+        <w:keepLines w:val="1"/>
       </w:pPr>
       <w:r>
         <w:rPr>
@@ -4174,6 +3362,7 @@
         <w:rPr>
           <w:lang w:val="en-GB"/>
         </w:rPr>
+        <w:keepLines w:val="1"/>
       </w:pPr>
       <w:r>
         <w:rPr>
@@ -4232,6 +3421,7 @@
         <w:rPr>
           <w:lang w:val="en-GB"/>
         </w:rPr>
+        <w:keepLines w:val="1"/>
       </w:pPr>
       <w:r>
         <w:rPr>
@@ -4280,213 +3470,7 @@
         <w:rPr>
           <w:lang w:val="en-GB"/>
         </w:rPr>
-      </w:pPr>
-      <w:proofErr w:type="spellStart"/>
-      <w:r>
-        <w:rPr>
-          <w:rFonts w:ascii="Arial" w:eastAsia="Arial" w:hAnsi="Arial" w:cs="Arial"/>
-          <w:lang w:val="en-GB"/>
-        </w:rPr>
-        <w:t>Paszke</w:t>
-      </w:r>
-      <w:proofErr w:type="spellEnd"/>
-      <w:r>
-        <w:rPr>
-          <w:rFonts w:ascii="Arial" w:eastAsia="Arial" w:hAnsi="Arial" w:cs="Arial"/>
-          <w:lang w:val="en-GB"/>
-        </w:rPr>
-        <w:t xml:space="preserve">, A., Gross, S., Massa, F., Lerer, A., Bradbury, J., Chanan, G., Killeen, T., Lin, Z., </w:t>
-      </w:r>
-      <w:proofErr w:type="spellStart"/>
-      <w:r>
-        <w:rPr>
-          <w:rFonts w:ascii="Arial" w:eastAsia="Arial" w:hAnsi="Arial" w:cs="Arial"/>
-          <w:lang w:val="en-GB"/>
-        </w:rPr>
-        <w:t>Gimelshein</w:t>
-      </w:r>
-      <w:proofErr w:type="spellEnd"/>
-      <w:r>
-        <w:rPr>
-          <w:rFonts w:ascii="Arial" w:eastAsia="Arial" w:hAnsi="Arial" w:cs="Arial"/>
-          <w:lang w:val="en-GB"/>
-        </w:rPr>
-        <w:t xml:space="preserve">, N., </w:t>
-      </w:r>
-      <w:proofErr w:type="spellStart"/>
-      <w:r>
-        <w:rPr>
-          <w:rFonts w:ascii="Arial" w:eastAsia="Arial" w:hAnsi="Arial" w:cs="Arial"/>
-          <w:lang w:val="en-GB"/>
-        </w:rPr>
-        <w:t>Antiga</w:t>
-      </w:r>
-      <w:proofErr w:type="spellEnd"/>
-      <w:r>
-        <w:rPr>
-          <w:rFonts w:ascii="Arial" w:eastAsia="Arial" w:hAnsi="Arial" w:cs="Arial"/>
-          <w:lang w:val="en-GB"/>
-        </w:rPr>
-        <w:t xml:space="preserve">, L., </w:t>
-      </w:r>
-      <w:proofErr w:type="spellStart"/>
-      <w:r>
-        <w:rPr>
-          <w:rFonts w:ascii="Arial" w:eastAsia="Arial" w:hAnsi="Arial" w:cs="Arial"/>
-          <w:lang w:val="en-GB"/>
-        </w:rPr>
-        <w:t>Desmaison</w:t>
-      </w:r>
-      <w:proofErr w:type="spellEnd"/>
-      <w:r>
-        <w:rPr>
-          <w:rFonts w:ascii="Arial" w:eastAsia="Arial" w:hAnsi="Arial" w:cs="Arial"/>
-          <w:lang w:val="en-GB"/>
-        </w:rPr>
-        <w:t xml:space="preserve">, A., Köpf, A., Yang, E., DeVito, Z., Raison, M., Tejani, A., </w:t>
-      </w:r>
-      <w:proofErr w:type="spellStart"/>
-      <w:r>
-        <w:rPr>
-          <w:rFonts w:ascii="Arial" w:eastAsia="Arial" w:hAnsi="Arial" w:cs="Arial"/>
-          <w:lang w:val="en-GB"/>
-        </w:rPr>
-        <w:t>Chilamkurthy</w:t>
-      </w:r>
-      <w:proofErr w:type="spellEnd"/>
-      <w:r>
-        <w:rPr>
-          <w:rFonts w:ascii="Arial" w:eastAsia="Arial" w:hAnsi="Arial" w:cs="Arial"/>
-          <w:lang w:val="en-GB"/>
-        </w:rPr>
-        <w:t xml:space="preserve">, S., Steiner, B., Fang, L., … Chintala, S. (2019). </w:t>
-      </w:r>
-      <w:proofErr w:type="spellStart"/>
-      <w:r>
-        <w:rPr>
-          <w:rFonts w:ascii="Arial" w:eastAsia="Arial" w:hAnsi="Arial" w:cs="Arial"/>
-          <w:lang w:val="en-GB"/>
-        </w:rPr>
-        <w:t>PyTorch</w:t>
-      </w:r>
-      <w:proofErr w:type="spellEnd"/>
-      <w:r>
-        <w:rPr>
-          <w:rFonts w:ascii="Arial" w:eastAsia="Arial" w:hAnsi="Arial" w:cs="Arial"/>
-          <w:lang w:val="en-GB"/>
-        </w:rPr>
-        <w:t xml:space="preserve">: An imperative style, high-performance deep learning library. </w:t>
-      </w:r>
-      <w:proofErr w:type="spellStart"/>
-      <w:r>
-        <w:rPr>
-          <w:rFonts w:ascii="Arial" w:eastAsia="Arial" w:hAnsi="Arial" w:cs="Arial"/>
-          <w:i/>
-          <w:lang w:val="en-GB"/>
-        </w:rPr>
-        <w:t>arXiv</w:t>
-      </w:r>
-      <w:proofErr w:type="spellEnd"/>
-      <w:r>
-        <w:rPr>
-          <w:rFonts w:ascii="Arial" w:eastAsia="Arial" w:hAnsi="Arial" w:cs="Arial"/>
-          <w:lang w:val="en-GB"/>
-        </w:rPr>
-        <w:t xml:space="preserve">. </w:t>
-      </w:r>
-      <w:hyperlink r:id="rId23" w:history="1">
-        <w:r>
-          <w:rPr>
-            <w:rStyle w:val="Hyperlink"/>
-            <w:rFonts w:ascii="Arial" w:eastAsia="Arial" w:hAnsi="Arial" w:cs="Arial"/>
-            <w:lang w:val="en-GB"/>
-          </w:rPr>
-          <w:t>https://doi.org/10.48550/arXiv.1912.01703</w:t>
-        </w:r>
-      </w:hyperlink>
-    </w:p>
-    <w:p>
-      <w:pPr>
-        <w:pStyle w:val="BodyText"/>
-        <w:spacing w:after="60" w:line="360" w:lineRule="auto"/>
-        <w:ind w:left="720" w:hanging="720"/>
-        <w:rPr>
-          <w:lang w:val="en-GB"/>
-        </w:rPr>
-      </w:pPr>
-      <w:r>
-        <w:rPr>
-          <w:rFonts w:ascii="Arial" w:eastAsia="Arial" w:hAnsi="Arial" w:cs="Arial"/>
-          <w:lang w:val="en-GB"/>
-        </w:rPr>
-        <w:t xml:space="preserve">Redmon, J., </w:t>
-      </w:r>
-      <w:proofErr w:type="spellStart"/>
-      <w:r>
-        <w:rPr>
-          <w:rFonts w:ascii="Arial" w:eastAsia="Arial" w:hAnsi="Arial" w:cs="Arial"/>
-          <w:lang w:val="en-GB"/>
-        </w:rPr>
-        <w:t>Divvala</w:t>
-      </w:r>
-      <w:proofErr w:type="spellEnd"/>
-      <w:r>
-        <w:rPr>
-          <w:rFonts w:ascii="Arial" w:eastAsia="Arial" w:hAnsi="Arial" w:cs="Arial"/>
-          <w:lang w:val="en-GB"/>
-        </w:rPr>
-        <w:t xml:space="preserve">, S., </w:t>
-      </w:r>
-      <w:proofErr w:type="spellStart"/>
-      <w:r>
-        <w:rPr>
-          <w:rFonts w:ascii="Arial" w:eastAsia="Arial" w:hAnsi="Arial" w:cs="Arial"/>
-          <w:lang w:val="en-GB"/>
-        </w:rPr>
-        <w:t>Girshick</w:t>
-      </w:r>
-      <w:proofErr w:type="spellEnd"/>
-      <w:r>
-        <w:rPr>
-          <w:rFonts w:ascii="Arial" w:eastAsia="Arial" w:hAnsi="Arial" w:cs="Arial"/>
-          <w:lang w:val="en-GB"/>
-        </w:rPr>
-        <w:t xml:space="preserve">, R., &amp; Farhadi, A. (2016). You only look once: Unified, real-time object detection. En </w:t>
-      </w:r>
-      <w:r>
-        <w:rPr>
-          <w:rFonts w:ascii="Arial" w:eastAsia="Arial" w:hAnsi="Arial" w:cs="Arial"/>
-          <w:i/>
-          <w:lang w:val="en-GB"/>
-        </w:rPr>
-        <w:t>2016 IEEE Conference on Computer Vision and Pattern Recognition (CVPR)</w:t>
-      </w:r>
-      <w:r>
-        <w:rPr>
-          <w:rFonts w:ascii="Arial" w:eastAsia="Arial" w:hAnsi="Arial" w:cs="Arial"/>
-          <w:lang w:val="en-GB"/>
-        </w:rPr>
-        <w:t xml:space="preserve"> (pp. 779-788). IEEE. </w:t>
-      </w:r>
-      <w:hyperlink r:id="rId24" w:history="1">
-        <w:r>
-          <w:rPr>
-            <w:rStyle w:val="Hyperlink"/>
-            <w:rFonts w:ascii="Arial" w:eastAsia="Arial" w:hAnsi="Arial" w:cs="Arial"/>
-            <w:lang w:val="en-GB"/>
-          </w:rPr>
-          <w:t>https://doi.org/10.1109/CVPR.2016.91</w:t>
-        </w:r>
-      </w:hyperlink>
-    </w:p>
-    <w:p>
-      <w:pPr>
-        <w:pStyle w:val="BodyText"/>
-        <w:spacing w:after="60" w:line="360" w:lineRule="auto"/>
-        <w:ind w:left="720" w:hanging="720"/>
-        <w:rPr>
-          <w:lang w:val="en-GB"/>
-        </w:rPr>
+        <w:keepLines w:val="1"/>
       </w:pPr>
       <w:r>
         <w:rPr>
@@ -4544,6 +3528,7 @@
         <w:pStyle w:val="BodyText"/>
         <w:spacing w:after="60" w:line="360" w:lineRule="auto"/>
         <w:ind w:left="720" w:hanging="720"/>
+        <w:keepLines w:val="1"/>
       </w:pPr>
       <w:r>
         <w:rPr>
@@ -4714,6 +3699,8 @@
         <w:rPr>
           <w:lang w:val="es-AR"/>
         </w:rPr>
+        <w:keepNext w:val="1"/>
+        <w:pageBreakBefore w:val="1"/>
       </w:pPr>
       <w:r>
         <w:rPr>
@@ -4731,6 +3718,8 @@
         <w:rPr>
           <w:rFonts w:ascii="Arial" w:eastAsia="Arial" w:hAnsi="Arial" w:cs="Arial"/>
         </w:rPr>
+        <w:keepNext w:val="1"/>
+        <w:keepLines w:val="1"/>
       </w:pPr>
       <w:r>
         <w:rPr>
@@ -4763,6 +3752,7 @@
         <w:rPr>
           <w:rFonts w:ascii="Arial" w:eastAsia="Arial" w:hAnsi="Arial" w:cs="Arial"/>
         </w:rPr>
+        <w:keepNext w:val="1"/>
       </w:pPr>
       <w:r>
         <w:rPr>
@@ -4825,6 +3815,7 @@
         <w:spacing w:before="137" w:line="360" w:lineRule="auto"/>
         <w:ind w:left="101" w:right="115"/>
         <w:jc w:val="both"/>
+        <w:keepNext w:val="1"/>
       </w:pPr>
     </w:p>
     <w:p>
@@ -4833,6 +3824,7 @@
         <w:spacing w:before="137" w:line="360" w:lineRule="auto"/>
         <w:ind w:left="101" w:right="115"/>
         <w:jc w:val="both"/>
+        <w:keepLines w:val="1"/>
       </w:pPr>
       <w:r>
         <w:rPr>

</xml_diff>

<commit_message>
Exposicion simple: nueva presentacion, articulo y README con el enfoque final
- presentacion.html: 12 diapositivas animadas para publico no tecnico, demo en
  vivo con fotos, ejemplo real de falsa deteccion y propuesta con mapa para la
  Alcaldia de Santa Cruz; notas del orador con el guion
- articulo y README: el sistema detecta solo y la revision humana se limita a
  los casos dudosos (propuesta); el celular autonomo queda para la segunda etapa
- webcam.py y abrir_camara.bat: mensajes de avance durante la carga
</commit_message>
<xml_diff>
--- a/docs/articulo_deteccion_baches.docx
+++ b/docs/articulo_deteccion_baches.docx
@@ -386,7 +386,7 @@
         <w:rPr>
           <w:rFonts w:ascii="Arial" w:eastAsia="Arial" w:hAnsi="Arial" w:cs="Arial"/>
         </w:rPr>
-        <w:t xml:space="preserve">La detección de baches mediante imágenes constituye una aplicación de la visión por computadora al mantenimiento de carreteras. Las revisiones de este campo describen sistemas que identifican daños visibles en fotografías y videos, con resultados que dependen de las condiciones de captura y de los datos de evaluación (Ma et al., 2022). Su interés práctico consiste en convertir material visual en evidencia que una persona pueda revisar. Para Santa Cruz de la Sierra, este proyecto plantea una herramienta de apoyo a la inspección vial: registrar posibles baches y conservar imágenes de referencia para su posterior verificación.</w:t>
+        <w:t>La detección de baches mediante imágenes constituye una aplicación de la visión por computadora al mantenimiento de carreteras. Las revisiones de este campo describen sistemas que identifican daños visibles en fotografías y videos, con resultados que dependen de las condiciones de captura y de los datos de evaluación (Ma et al., 2022). Su interés práctico consiste en que el sistema identifique los daños de forma automática y conserve evidencia visual de cada uno. Para Santa Cruz de la Sierra, este proyecto plantea una herramienta para la inspección vial: detectar baches de forma automática y conservar una imagen de cada hallazgo.</w:t>
       </w:r>
     </w:p>
     <w:p>
@@ -513,7 +513,7 @@
         <w:rPr>
           <w:rFonts w:ascii="Arial" w:eastAsia="Arial" w:hAnsi="Arial" w:cs="Arial"/>
         </w:rPr>
-        <w:t xml:space="preserve">La demostración utiliza una webcam de 640 × 480 píxeles y fotografías de referencia. Se mide la velocidad con y sin ventana. Para el uso con celular, el teléfono graba y la computadora procesa el archivo posteriormente: guarda un video con los recuadros, el cuadro con la detección más confiable cuando existe alguna y una tabla de resumen. Esta tabla registra cuadros procesados, cuadros con detecciones, confianza máxima y tiempo. El flujo se comprueba con un video corto de prueba; todavía no se evalúan recorridos reales de Santa Cruz ni se registran coordenadas geográficas.</w:t>
+        <w:t>La demostración utiliza una webcam de 640 × 480 píxeles y fotografías de referencia. Se mide la velocidad con y sin ventana. En esta versión, los videos, incluidos los grabados con un celular, se procesan en la computadora: el sistema guarda un video con los recuadros, el cuadro con la detección más confiable cuando existe alguna y una tabla de resumen. Esta tabla registra cuadros procesados, cuadros con detecciones, confianza máxima y tiempo. El flujo se comprueba con un video corto de prueba; todavía no se evalúan recorridos reales de Santa Cruz ni se registran coordenadas geográficas. La ejecución del detector en el propio celular se plantea para la segunda etapa.</w:t>
       </w:r>
     </w:p>
     <w:p>
@@ -554,7 +554,7 @@
         <w:rPr>
           <w:rFonts w:ascii="Arial" w:eastAsia="Arial" w:hAnsi="Arial" w:cs="Arial"/>
         </w:rPr>
-        <w:t xml:space="preserve">El prototipo admite cámara, imagen y video. La ventana integra controles para ajustar la confianza, pausar, cambiar de cámara y guardar una captura. El procesamiento por lotes permite analizar videos del celular y conservar los resultados para su revisión posterior. La huella del archivo del detector coincide con la revisada en la fuente y el análisis heurístico no encuentra funciones clasificadas como peligrosas. Esta revisión reduce incertidumbre sobre el archivo utilizado, pero no garantiza su inocuidad; la literatura registra riesgos al reutilizar archivos de aprendizaje automático de terceros (Zhao et al., 2024).</w:t>
+        <w:t>El prototipo admite cámara, imagen y video. La ventana integra controles para ajustar la confianza, pausar, cambiar de cámara y guardar una captura. El procesamiento por lotes permite analizar videos del celular y conservar los resultados como evidencia. La huella del archivo del detector coincide con la revisada en la fuente y el análisis heurístico no encuentra funciones clasificadas como peligrosas. Esta revisión reduce incertidumbre sobre el archivo utilizado, pero no garantiza su inocuidad; la literatura registra riesgos al reutilizar archivos de aprendizaje automático de terceros (Zhao et al., 2024).</w:t>
       </w:r>
     </w:p>
     <w:p>
@@ -2931,7 +2931,7 @@
         <w:rPr>
           <w:rFonts w:ascii="Arial" w:eastAsia="Arial" w:hAnsi="Arial" w:cs="Arial"/>
         </w:rPr>
-        <w:t xml:space="preserve">El resultado disponible es un prototipo local capaz de producir evidencia visual revisable. Podría servir como apoyo a la Alcaldía de Santa Cruz de la Sierra para preparar inspecciones, reunir ejemplos de posibles daños y ordenar material de recorridos. Todavía no se ha probado su uso por personal municipal, ni se ha medido ahorro de tiempo, costo o cobertura. Tampoco existe una estimación automática de profundidad, gravedad o prioridad de reparación. Una detección requiere revisión humana antes de considerarse un daño confirmado.</w:t>
+        <w:t>El resultado disponible es un prototipo local capaz de detectar baches y conservar evidencia visual de cada detección. Podría servir como apoyo a la Alcaldía de Santa Cruz de la Sierra para preparar inspecciones, reunir ejemplos de posibles daños y ordenar material de recorridos. Todavía no se ha probado su uso por personal municipal, ni se ha medido ahorro de tiempo, costo o cobertura. Tampoco existe una estimación automática de profundidad, gravedad o prioridad de reparación. Se propone que la revisión humana se limite a las detecciones de confianza intermedia, entre 0,25 y 0,35, en las que el sistema duda; las de mayor confianza se registrarían de forma automática.</w:t>
       </w:r>
     </w:p>
     <w:p>
@@ -2984,7 +2984,7 @@
         <w:rPr>
           <w:rFonts w:ascii="Arial" w:eastAsia="Arial" w:hAnsi="Arial" w:cs="Arial"/>
         </w:rPr>
-        <w:t xml:space="preserve">El proyecto integra un sistema funcional de detección de baches mediante cámara, imágenes y videos, con controles para revisar las salidas y conservar evidencia. La evaluación reproduce las cifras de la fuente y un ajuste del filtro de recuadros repetidos alcanza un mAP50 de 0,739 en la prueba de referencia. Las omisiones al aumentar la confianza y la falsa detección observada muestran la necesidad de revisar sus resultados. Su utilidad para el mantenimiento vial cruceño es potencial: todavía se requiere evaluar recorridos reales y registrar ejemplos de aciertos y errores.</w:t>
+        <w:t>El proyecto integra un sistema funcional de detección de baches mediante cámara, imágenes y videos, con controles para revisar las salidas y conservar evidencia. La evaluación reproduce las cifras de la fuente y un ajuste del filtro de recuadros repetidos alcanza un mAP50 de 0,739 en la prueba de referencia. Las omisiones al aumentar la confianza y la falsa detección observada indican que su entrenamiento debe ampliarse con calles sin baches y escenas locales. Su utilidad para el mantenimiento vial cruceño es potencial: todavía se requiere evaluar recorridos reales y registrar ejemplos de aciertos y errores.</w:t>
       </w:r>
     </w:p>
     <w:p>
@@ -2997,7 +2997,7 @@
         <w:rPr>
           <w:rFonts w:ascii="Arial" w:eastAsia="Arial" w:hAnsi="Arial" w:cs="Arial"/>
         </w:rPr>
-        <w:t xml:space="preserve">La segunda etapa abordará datos locales, un entrenamiento documentado y la vinculación de detecciones con un mapa de Santa Cruz de la Sierra. Para ello será necesario registrar hora y ubicación del celular, relacionarlas con los cuadros y agrupar observaciones repetidas de un mismo posible bache. La georreferenciación y el uso municipal se mantienen como acciones futuras.</w:t>
+        <w:t>La segunda etapa abordará datos locales, un entrenamiento documentado, la ejecución del detector directamente en el celular y la vinculación de detecciones con un mapa de Santa Cruz de la Sierra. Para ello será necesario registrar hora y ubicación del celular, relacionarlas con los cuadros y agrupar observaciones repetidas de un mismo posible bache. La georreferenciación y el uso municipal se mantienen como acciones futuras.</w:t>
       </w:r>
     </w:p>
     <w:p>

</xml_diff>

<commit_message>
Articulo: palabras clave en titulo y resumenes, Tabla 1 en cursiva, enlaces visibles y sin salto de pagina extra
- titulo y palabras clave (Tesauro UNESCO): inteligencia artificial, mantenimiento, carretera,
  presentes en los tres titulos y los tres resumenes, como pide la plantilla
- titulo de la Tabla 1 en cursiva (APA 7, igual que la Tabla 2)
- URL visible en la referencia del repositorio de origen y en Materiales y metodos
- se quita el salto de pagina antes de Derechos de uso (no esta en la plantilla); 12 paginas
</commit_message>
<xml_diff>
--- a/docs/articulo_deteccion_baches.docx
+++ b/docs/articulo_deteccion_baches.docx
@@ -29,7 +29,7 @@
           <w:b/>
           <w:sz w:val="28"/>
         </w:rPr>
-        <w:t xml:space="preserve">Detección de baches para el mantenimiento vial en Santa Cruz</w:t>
+        <w:t>Detección de baches con inteligencia artificial para el mantenimiento de carreteras cruceñas</w:t>
       </w:r>
     </w:p>
     <w:p>
@@ -47,7 +47,7 @@
           <w:i/>
           <w:lang w:val="en-GB"/>
         </w:rPr>
-        <w:t xml:space="preserve">Pothole detection to support road maintenance in Santa Cruz</w:t>
+        <w:t>Pothole detection with artificial intelligence for the maintenance of roads in Santa Cruz</w:t>
       </w:r>
     </w:p>
     <w:p>
@@ -61,7 +61,7 @@
           <w:rFonts w:ascii="Arial" w:eastAsia="Arial" w:hAnsi="Arial" w:cs="Arial"/>
           <w:i/>
         </w:rPr>
-        <w:t xml:space="preserve">Detecção de buracos para a manutenção viária em Santa Cruz</w:t>
+        <w:t>Detecção de buracos com inteligência artificial para a manutenção de rodovias em Santa Cruz</w:t>
       </w:r>
     </w:p>
     <w:p>
@@ -236,7 +236,7 @@
         <w:rPr>
           <w:rFonts w:ascii="Arial" w:eastAsia="Arial" w:hAnsi="Arial" w:cs="Arial"/>
         </w:rPr>
-        <w:t xml:space="preserve">El objetivo del proyecto es implementar y evaluar un prototipo de detección de baches con utilidad potencial para el mantenimiento vial de Santa Cruz de la Sierra. El sistema integra un detector previamente entrenado por terceros y permite analizar imágenes, una cámara y videos grabados con un celular. Se realiza una evaluación cuantitativa con 4.719 imágenes de referencia y pruebas funcionales en una computadora sin tarjeta gráfica dedicada. Las métricas reproducidas alcanzan un mAP50 de 0,730 en validación y 0,711 en prueba. Un ajuste del filtro de cajas repetidas eleva el mAP50 de prueba a 0,739. El prototipo conserva videos anotados y un resumen por archivo. Las dificultades observadas incluyen baches que dejan de mostrarse al aumentar la exigencia de confianza y una falsa detección sobre un rostro. El sistema constituye una base funcional para reunir evidencia visual que podría apoyar la revisión de calles por la Alcaldía cruceña. Su desempeño en recorridos reales de Santa Cruz todavía no se ha medido; tampoco se ha reproducido el entrenamiento original ni implementado la georreferenciación.</w:t>
+        <w:t>El objetivo del proyecto es implementar y evaluar un prototipo de detección de baches de carretera basado en inteligencia artificial, con utilidad potencial para el mantenimiento vial de Santa Cruz de la Sierra. El sistema integra un detector previamente entrenado por terceros y permite analizar imágenes, una cámara y videos grabados con un celular. Se realiza una evaluación cuantitativa con 4.719 imágenes de referencia y pruebas funcionales en una computadora sin tarjeta gráfica dedicada. Las métricas reproducidas alcanzan un mAP50 de 0,730 en validación y 0,711 en prueba. Un ajuste del filtro de cajas repetidas eleva el mAP50 de prueba a 0,739. El prototipo conserva videos anotados y un resumen por archivo. Las dificultades observadas incluyen baches que dejan de mostrarse al aumentar la exigencia de confianza y una falsa detección sobre un rostro. El sistema constituye una base funcional para reunir evidencia visual que podría apoyar la revisión de calles por la Alcaldía cruceña. Su desempeño en recorridos reales de Santa Cruz todavía no se ha medido; tampoco se ha reproducido el entrenamiento original ni implementado la georreferenciación.</w:t>
       </w:r>
     </w:p>
     <w:p>
@@ -257,7 +257,7 @@
         <w:rPr>
           <w:rFonts w:ascii="Arial" w:eastAsia="Arial" w:hAnsi="Arial" w:cs="Arial"/>
         </w:rPr>
-        <w:t xml:space="preserve"> inteligencia artificial, reconocimiento de formas, carretera</w:t>
+        <w:t xml:space="preserve"> inteligencia artificial, mantenimiento, carretera</w:t>
       </w:r>
     </w:p>
     <w:p>
@@ -284,7 +284,7 @@
           <w:rFonts w:ascii="Arial" w:eastAsia="Arial" w:hAnsi="Arial" w:cs="Arial"/>
           <w:lang w:val="en-GB"/>
         </w:rPr>
-        <w:t xml:space="preserve">The project aims to implement and evaluate a pothole detection prototype with potential use in road maintenance in Santa Cruz de la Sierra. The system integrates a detector previously trained by third parties and processes images, a camera feed, and videos recorded with a mobile phone. A quantitative assessment uses 4,719 reference images and functional tests on a computer without a dedicated graphics card. Reproduced metrics reach an mAP50 of 0.730 on validation and 0.711 on test. Adjusting the duplicate-box filter raises test mAP50 to 0.739. The prototype saves annotated videos and a summary for each file. Observed difficulties include potholes disappearing when the confidence requirement is increased and a false detection on a face. The system provides a functional basis for collecting visual evidence that could support municipal road inspections. Performance on real routes in Santa Cruz has not yet been measured; the original training has not been reproduced, and georeferencing has not been implemented.</w:t>
+        <w:t>The project aims to implement and evaluate a pothole detection prototype based on artificial intelligence, with potential use in the maintenance of roads in Santa Cruz de la Sierra. The system integrates a detector previously trained by third parties and processes images, a camera feed, and videos recorded with a mobile phone. A quantitative assessment uses 4,719 reference images and functional tests on a computer without a dedicated graphics card. Reproduced metrics reach an mAP50 of 0.730 on validation and 0.711 on test. Adjusting the duplicate-box filter raises test mAP50 to 0.739. The prototype saves annotated videos and a summary for each file. Observed difficulties include potholes disappearing when the confidence requirement is increased and a false detection on a face. The system provides a functional basis for collecting visual evidence that could support municipal road inspections. Performance on real routes in Santa Cruz has not yet been measured; the original training has not been reproduced, and georeferencing has not been implemented.</w:t>
       </w:r>
     </w:p>
     <w:p>
@@ -310,7 +310,7 @@
           <w:rFonts w:ascii="Arial" w:eastAsia="Arial" w:hAnsi="Arial" w:cs="Arial"/>
           <w:lang w:val="en-GB"/>
         </w:rPr>
-        <w:t xml:space="preserve"> artificial intelligence, pattern recognition, roads</w:t>
+        <w:t xml:space="preserve"> artificial intelligence, maintenance, roads</w:t>
       </w:r>
     </w:p>
     <w:p>
@@ -338,7 +338,7 @@
         <w:rPr>
           <w:rFonts w:ascii="Arial" w:eastAsia="Arial" w:hAnsi="Arial" w:cs="Arial"/>
         </w:rPr>
-        <w:t xml:space="preserve">O objetivo do projeto é implementar e avaliar um protótipo de detecção de buracos com utilidade potencial para a manutenção viária de Santa Cruz de la Sierra. O sistema integra um detector previamente treinado por terceiros e permite analisar imagens, uma câmera e vídeos gravados com um celular. A avaliação quantitativa utiliza 4.719 imagens de referência e testes funcionais em um computador sem placa gráfica dedicada. As métricas reproduzidas alcançam mAP50 de 0,730 na validação e 0,711 no teste. Um ajuste do filtro de caixas repetidas eleva o mAP50 de teste para 0,739. O protótipo salva vídeos anotados e um resumo por arquivo. As dificuldades observadas incluem buracos que deixam de aparecer ao aumentar a exigência de confiança e uma falsa detecção sobre um rosto. O sistema oferece uma base funcional para reunir evidências visuais que poderiam apoiar a inspeção municipal de ruas. O desempenho em percursos reais de Santa Cruz ainda não foi medido; o treinamento original não foi reproduzido e a georreferenciação não foi implementada.</w:t>
+        <w:t>O objetivo do projeto é implementar e avaliar um protótipo de detecção de buracos em rodovias baseado em inteligência artificial, com utilidade potencial para a manutenção viária de Santa Cruz de la Sierra. O sistema integra um detector previamente treinado por terceiros e permite analisar imagens, uma câmera e vídeos gravados com um celular. A avaliação quantitativa utiliza 4.719 imagens de referência e testes funcionais em um computador sem placa gráfica dedicada. As métricas reproduzidas alcançam mAP50 de 0,730 na validação e 0,711 no teste. Um ajuste do filtro de caixas repetidas eleva o mAP50 de teste para 0,739. O protótipo salva vídeos anotados e um resumo por arquivo. As dificuldades observadas incluem buracos que deixam de aparecer ao aumentar a exigência de confiança e uma falsa detecção sobre um rosto. O sistema oferece uma base funcional para reunir evidências visuais que poderiam apoiar a inspeção municipal de ruas. O desempenho em percursos reais de Santa Cruz ainda não foi medido; o treinamento original não foi reproduzido e a georreferenciação não foi implementada.</w:t>
       </w:r>
     </w:p>
     <w:p>
@@ -359,7 +359,7 @@
         <w:rPr>
           <w:rFonts w:ascii="Arial" w:eastAsia="Arial" w:hAnsi="Arial" w:cs="Arial"/>
         </w:rPr>
-        <w:t xml:space="preserve"> inteligência artificial, reconhecimento de padrões, rodovias</w:t>
+        <w:t xml:space="preserve"> inteligência artificial, manutenção, rodovias</w:t>
       </w:r>
     </w:p>
     <w:p>
@@ -439,7 +439,7 @@
         <w:rPr>
           <w:rFonts w:ascii="Arial" w:eastAsia="Arial" w:hAnsi="Arial" w:cs="Arial"/>
         </w:rPr>
-        <w:t xml:space="preserve">Se desarrolla un prototipo de escritorio y se evalúa mediante pruebas cuantitativas y funcionales. El sistema recibe una imagen, una cámara conectada o un video, identifica regiones compatibles con baches y dibuja recuadros con un indicador de confianza. La interfaz permite ajustar qué detecciones se muestran, pausar la vista y guardar capturas. El detector previamente entrenado y el conjunto de datos provienen del repositorio de Bisman-Singh-Dev, en una versión fijada para mantener la misma base de evaluación. El código del proyecto y las salidas de las pruebas se encuentran en el repositorio público de Leonardo Duran Cuenca.</w:t>
+        <w:t>Se desarrolla un prototipo de escritorio y se evalúa mediante pruebas cuantitativas y funcionales. El sistema recibe una imagen, una cámara conectada o un video, identifica regiones compatibles con baches y dibuja recuadros con un indicador de confianza. La interfaz permite ajustar qué detecciones se muestran, pausar la vista y guardar capturas. El detector previamente entrenado y el conjunto de datos provienen del repositorio de Bisman-Singh-Dev, en una versión fijada para mantener la misma base de evaluación. El código del proyecto y las salidas de las pruebas se encuentran en el repositorio público</w:t>
       </w:r>
       <w:hyperlink r:id="rId10">
         <w:r>
@@ -447,9 +447,15 @@
             <w:color w:val="0563C1"/>
             <w:u w:val="single"/>
           </w:rPr>
-          <w:t xml:space="preserve"> Código y resultados.</w:t>
+          <w:t xml:space="preserve"> https://github.com/Duranzzz/detector-baches</w:t>
         </w:r>
       </w:hyperlink>
+      <w:r>
+        <w:rPr>
+          <w:rFonts w:ascii="Arial" w:eastAsia="Arial" w:hAnsi="Arial" w:cs="Arial"/>
+        </w:rPr>
+        <w:t>.</w:t>
+      </w:r>
     </w:p>
     <w:p>
       <w:pPr>
@@ -605,6 +611,7 @@
       <w:r>
         <w:rPr>
           <w:rFonts w:ascii="Arial" w:eastAsia="Arial" w:hAnsi="Arial" w:cs="Arial"/>
+          <w:i/>
           <w:color w:val="000000"/>
           <w:sz w:val="24"/>
         </w:rPr>
@@ -3129,7 +3136,7 @@
             <w:color w:val="0563C1"/>
             <w:u w:val="single"/>
           </w:rPr>
-          <w:t xml:space="preserve">Repositorio de origen.</w:t>
+          <w:t xml:space="preserve">https://github.com/Bisman-Singh-Dev/YOLO-Pothole-Detection-Model/tree/bd8238b0f87083a1cea658336307d15b54eb7500</w:t>
         </w:r>
       </w:hyperlink>
     </w:p>
@@ -3700,7 +3707,6 @@
           <w:lang w:val="es-AR"/>
         </w:rPr>
         <w:keepNext w:val="1"/>
-        <w:pageBreakBefore w:val="1"/>
       </w:pPr>
       <w:r>
         <w:rPr>

</xml_diff>